<commit_message>
refactor: apply full project-wide review and improvements
</commit_message>
<xml_diff>
--- a/documentation/PA2/Design_Document.docx
+++ b/documentation/PA2/Design_Document.docx
@@ -4,7 +4,7 @@
   <w:body>
     <w:p>
       <w:pPr>
-        <w:pStyle w:val="Heading1"/>
+        <w:pStyle w:val="Balk1"/>
       </w:pPr>
       <w:r>
         <w:t xml:space="preserve">Design Document – </w:t>
@@ -18,7 +18,7 @@
     <w:p/>
     <w:p>
       <w:pPr>
-        <w:pStyle w:val="Heading2"/>
+        <w:pStyle w:val="Balk2"/>
         <w:spacing w:before="0"/>
         <w:rPr>
           <w:rFonts w:ascii="Times New Roman" w:eastAsia="Times New Roman" w:hAnsi="Times New Roman" w:cs="Times New Roman"/>
@@ -26,7 +26,7 @@
       </w:pPr>
       <w:r>
         <w:rPr>
-          <w:rStyle w:val="Strong"/>
+          <w:rStyle w:val="Gl"/>
           <w:rFonts w:ascii="Times New Roman" w:eastAsia="Times New Roman" w:hAnsi="Times New Roman" w:cs="Times New Roman"/>
           <w:color w:val="3465A4"/>
           <w:sz w:val="52"/>
@@ -916,7 +916,7 @@
     <w:p/>
     <w:p>
       <w:pPr>
-        <w:pStyle w:val="Heading2"/>
+        <w:pStyle w:val="Balk2"/>
       </w:pPr>
       <w:r>
         <w:lastRenderedPageBreak/>
@@ -925,7 +925,7 @@
     </w:p>
     <w:p>
       <w:pPr>
-        <w:pStyle w:val="Heading3"/>
+        <w:pStyle w:val="Balk3"/>
       </w:pPr>
       <w:r>
         <w:t>1.1 Project Description</w:t>
@@ -943,7 +943,7 @@
     </w:p>
     <w:p>
       <w:pPr>
-        <w:pStyle w:val="Heading3"/>
+        <w:pStyle w:val="Balk3"/>
       </w:pPr>
       <w:r>
         <w:t>1.2 System Architecture</w:t>
@@ -988,7 +988,7 @@
     </w:p>
     <w:p>
       <w:pPr>
-        <w:pStyle w:val="Heading3"/>
+        <w:pStyle w:val="Balk3"/>
       </w:pPr>
       <w:r>
         <w:t>1.3 Technology Stack</w:t>
@@ -1021,7 +1021,7 @@
     </w:p>
     <w:p>
       <w:pPr>
-        <w:pStyle w:val="Heading2"/>
+        <w:pStyle w:val="Balk2"/>
       </w:pPr>
       <w:r>
         <w:t>2. Implementation Details</w:t>
@@ -1029,7 +1029,7 @@
     </w:p>
     <w:p>
       <w:pPr>
-        <w:pStyle w:val="Heading3"/>
+        <w:pStyle w:val="Balk3"/>
       </w:pPr>
       <w:r>
         <w:t>2.1 Codebase Structure</w:t>
@@ -1142,7 +1142,7 @@
     </w:p>
     <w:p>
       <w:pPr>
-        <w:pStyle w:val="Heading3"/>
+        <w:pStyle w:val="Balk3"/>
       </w:pPr>
       <w:r>
         <w:t xml:space="preserve">2.2 Key </w:t>
@@ -1175,7 +1175,13 @@
       </w:r>
       <w:r>
         <w:br/>
-        <w:t>- Search Module: Provides search functionality by title, author, or ISBN, and returns availability status.</w:t>
+        <w:t>- Search Module: Provides search functionality by title</w:t>
+      </w:r>
+      <w:r>
+        <w:t xml:space="preserve"> </w:t>
+      </w:r>
+      <w:r>
+        <w:t>and returns availability status.</w:t>
       </w:r>
       <w:r>
         <w:br/>
@@ -1192,7 +1198,7 @@
     </w:p>
     <w:p>
       <w:pPr>
-        <w:pStyle w:val="Heading3"/>
+        <w:pStyle w:val="Balk3"/>
       </w:pPr>
       <w:r>
         <w:t>2.3 Component Interfaces</w:t>
@@ -1349,21 +1355,21 @@
       </w:r>
       <w:r>
         <w:br/>
+        <w:t xml:space="preserve">interface </w:t>
+      </w:r>
+      <w:proofErr w:type="spellStart"/>
+      <w:r>
+        <w:t>BorrowService</w:t>
+      </w:r>
+      <w:proofErr w:type="spellEnd"/>
+      <w:r>
+        <w:t xml:space="preserve"> {</w:t>
+      </w:r>
+      <w:r>
+        <w:br/>
       </w:r>
       <w:r>
         <w:lastRenderedPageBreak/>
-        <w:t xml:space="preserve">interface </w:t>
-      </w:r>
-      <w:proofErr w:type="spellStart"/>
-      <w:r>
-        <w:t>BorrowService</w:t>
-      </w:r>
-      <w:proofErr w:type="spellEnd"/>
-      <w:r>
-        <w:t xml:space="preserve"> {</w:t>
-      </w:r>
-      <w:r>
-        <w:br/>
         <w:t xml:space="preserve">    </w:t>
       </w:r>
       <w:proofErr w:type="spellStart"/>
@@ -1614,7 +1620,7 @@
     </w:p>
     <w:p>
       <w:pPr>
-        <w:pStyle w:val="Heading2"/>
+        <w:pStyle w:val="Balk2"/>
       </w:pPr>
       <w:r>
         <w:t>3. Use Case Support in Design</w:t>
@@ -1622,7 +1628,7 @@
     </w:p>
     <w:p>
       <w:pPr>
-        <w:pStyle w:val="Heading3"/>
+        <w:pStyle w:val="Balk3"/>
       </w:pPr>
       <w:r>
         <w:t>3.1 Use Case 1 – User Login</w:t>
@@ -1743,7 +1749,7 @@
     </w:p>
     <w:p>
       <w:pPr>
-        <w:pStyle w:val="Heading3"/>
+        <w:pStyle w:val="Balk3"/>
       </w:pPr>
       <w:r>
         <w:lastRenderedPageBreak/>
@@ -1809,7 +1815,13 @@
       </w:r>
       <w:r>
         <w:br/>
-        <w:t>1. User enters a keyword, title, author name, or ISBN in the search field.</w:t>
+        <w:t>1. User enters a</w:t>
+      </w:r>
+      <w:r>
+        <w:t xml:space="preserve"> </w:t>
+      </w:r>
+      <w:r>
+        <w:t>title in the search field.</w:t>
       </w:r>
       <w:r>
         <w:br/>
@@ -1870,7 +1882,7 @@
     </w:p>
     <w:p>
       <w:pPr>
-        <w:pStyle w:val="Heading3"/>
+        <w:pStyle w:val="Balk3"/>
       </w:pPr>
       <w:r>
         <w:t>3.3 Use Case 3 – Borrow Book</w:t>
@@ -2081,7 +2093,7 @@
     </w:p>
     <w:p>
       <w:pPr>
-        <w:pStyle w:val="Heading3"/>
+        <w:pStyle w:val="Balk3"/>
       </w:pPr>
       <w:r>
         <w:t>3.4 Use Case 4 – Admin Add Book</w:t>
@@ -2236,7 +2248,7 @@
     </w:p>
     <w:p>
       <w:pPr>
-        <w:pStyle w:val="Heading2"/>
+        <w:pStyle w:val="Balk2"/>
       </w:pPr>
       <w:r>
         <w:t>4. Design Decisions</w:t>
@@ -2244,7 +2256,7 @@
     </w:p>
     <w:p>
       <w:pPr>
-        <w:pStyle w:val="Heading3"/>
+        <w:pStyle w:val="Balk3"/>
       </w:pPr>
       <w:r>
         <w:t>4.1 Backend Technology Choice</w:t>
@@ -2268,7 +2280,7 @@
     </w:p>
     <w:p>
       <w:pPr>
-        <w:pStyle w:val="Heading3"/>
+        <w:pStyle w:val="Balk3"/>
       </w:pPr>
       <w:r>
         <w:t>4.2 Database Choice</w:t>
@@ -2292,7 +2304,7 @@
     </w:p>
     <w:p>
       <w:pPr>
-        <w:pStyle w:val="Heading3"/>
+        <w:pStyle w:val="Balk3"/>
       </w:pPr>
       <w:r>
         <w:t>4.3 Architectural Style</w:t>
@@ -2316,7 +2328,7 @@
     </w:p>
     <w:p>
       <w:pPr>
-        <w:pStyle w:val="Heading3"/>
+        <w:pStyle w:val="Balk3"/>
       </w:pPr>
       <w:r>
         <w:lastRenderedPageBreak/>
@@ -2342,7 +2354,7 @@
     </w:p>
     <w:p>
       <w:pPr>
-        <w:pStyle w:val="Heading2"/>
+        <w:pStyle w:val="Balk2"/>
       </w:pPr>
       <w:r>
         <w:t>5. Repository and Version Control</w:t>
@@ -2411,7 +2423,7 @@
     <w:p/>
     <w:p>
       <w:pPr>
-        <w:pStyle w:val="Heading2"/>
+        <w:pStyle w:val="Balk2"/>
       </w:pPr>
       <w:r>
         <w:t>6. Contribution Matrix</w:t>
@@ -5053,7 +5065,7 @@
     <w:lvl w:ilvl="0">
       <w:start w:val="1"/>
       <w:numFmt w:val="decimal"/>
-      <w:pStyle w:val="ListNumber3"/>
+      <w:pStyle w:val="ListeNumaras3"/>
       <w:lvlText w:val="%1."/>
       <w:lvlJc w:val="left"/>
       <w:pPr>
@@ -5071,7 +5083,7 @@
     <w:lvl w:ilvl="0">
       <w:start w:val="1"/>
       <w:numFmt w:val="decimal"/>
-      <w:pStyle w:val="ListNumber2"/>
+      <w:pStyle w:val="ListeNumaras2"/>
       <w:lvlText w:val="%1."/>
       <w:lvlJc w:val="left"/>
       <w:pPr>
@@ -5109,7 +5121,7 @@
     <w:lvl w:ilvl="0">
       <w:start w:val="1"/>
       <w:numFmt w:val="bullet"/>
-      <w:pStyle w:val="ListBullet3"/>
+      <w:pStyle w:val="ListeMaddemi3"/>
       <w:lvlText w:val=""/>
       <w:lvlJc w:val="left"/>
       <w:pPr>
@@ -5130,7 +5142,7 @@
     <w:lvl w:ilvl="0">
       <w:start w:val="1"/>
       <w:numFmt w:val="bullet"/>
-      <w:pStyle w:val="ListBullet2"/>
+      <w:pStyle w:val="ListeMaddemi2"/>
       <w:lvlText w:val=""/>
       <w:lvlJc w:val="left"/>
       <w:pPr>
@@ -5151,7 +5163,7 @@
     <w:lvl w:ilvl="0">
       <w:start w:val="1"/>
       <w:numFmt w:val="decimal"/>
-      <w:pStyle w:val="ListNumber"/>
+      <w:pStyle w:val="ListeNumaras"/>
       <w:lvlText w:val="%1."/>
       <w:lvlJc w:val="left"/>
       <w:pPr>
@@ -5169,7 +5181,7 @@
     <w:lvl w:ilvl="0">
       <w:start w:val="1"/>
       <w:numFmt w:val="bullet"/>
-      <w:pStyle w:val="ListBullet"/>
+      <w:pStyle w:val="ListeMaddemi"/>
       <w:lvlText w:val=""/>
       <w:lvlJc w:val="left"/>
       <w:pPr>
@@ -5604,11 +5616,11 @@
     <w:qFormat/>
     <w:rsid w:val="00FC693F"/>
   </w:style>
-  <w:style w:type="paragraph" w:styleId="Heading1">
+  <w:style w:type="paragraph" w:styleId="Balk1">
     <w:name w:val="heading 1"/>
     <w:basedOn w:val="Normal"/>
     <w:next w:val="Normal"/>
-    <w:link w:val="Heading1Char"/>
+    <w:link w:val="Balk1Char"/>
     <w:uiPriority w:val="9"/>
     <w:qFormat/>
     <w:rsid w:val="00FC693F"/>
@@ -5627,11 +5639,11 @@
       <w:szCs w:val="28"/>
     </w:rPr>
   </w:style>
-  <w:style w:type="paragraph" w:styleId="Heading2">
+  <w:style w:type="paragraph" w:styleId="Balk2">
     <w:name w:val="heading 2"/>
     <w:basedOn w:val="Normal"/>
     <w:next w:val="Normal"/>
-    <w:link w:val="Heading2Char"/>
+    <w:link w:val="Balk2Char"/>
     <w:uiPriority w:val="9"/>
     <w:unhideWhenUsed/>
     <w:qFormat/>
@@ -5651,11 +5663,11 @@
       <w:szCs w:val="26"/>
     </w:rPr>
   </w:style>
-  <w:style w:type="paragraph" w:styleId="Heading3">
+  <w:style w:type="paragraph" w:styleId="Balk3">
     <w:name w:val="heading 3"/>
     <w:basedOn w:val="Normal"/>
     <w:next w:val="Normal"/>
-    <w:link w:val="Heading3Char"/>
+    <w:link w:val="Balk3Char"/>
     <w:uiPriority w:val="9"/>
     <w:unhideWhenUsed/>
     <w:qFormat/>
@@ -5673,11 +5685,11 @@
       <w:color w:val="4F81BD" w:themeColor="accent1"/>
     </w:rPr>
   </w:style>
-  <w:style w:type="paragraph" w:styleId="Heading4">
+  <w:style w:type="paragraph" w:styleId="Balk4">
     <w:name w:val="heading 4"/>
     <w:basedOn w:val="Normal"/>
     <w:next w:val="Normal"/>
-    <w:link w:val="Heading4Char"/>
+    <w:link w:val="Balk4Char"/>
     <w:uiPriority w:val="9"/>
     <w:semiHidden/>
     <w:unhideWhenUsed/>
@@ -5698,11 +5710,11 @@
       <w:color w:val="4F81BD" w:themeColor="accent1"/>
     </w:rPr>
   </w:style>
-  <w:style w:type="paragraph" w:styleId="Heading5">
+  <w:style w:type="paragraph" w:styleId="Balk5">
     <w:name w:val="heading 5"/>
     <w:basedOn w:val="Normal"/>
     <w:next w:val="Normal"/>
-    <w:link w:val="Heading5Char"/>
+    <w:link w:val="Balk5Char"/>
     <w:uiPriority w:val="9"/>
     <w:semiHidden/>
     <w:unhideWhenUsed/>
@@ -5719,11 +5731,11 @@
       <w:color w:val="243F60" w:themeColor="accent1" w:themeShade="7F"/>
     </w:rPr>
   </w:style>
-  <w:style w:type="paragraph" w:styleId="Heading6">
+  <w:style w:type="paragraph" w:styleId="Balk6">
     <w:name w:val="heading 6"/>
     <w:basedOn w:val="Normal"/>
     <w:next w:val="Normal"/>
-    <w:link w:val="Heading6Char"/>
+    <w:link w:val="Balk6Char"/>
     <w:uiPriority w:val="9"/>
     <w:semiHidden/>
     <w:unhideWhenUsed/>
@@ -5742,11 +5754,11 @@
       <w:color w:val="243F60" w:themeColor="accent1" w:themeShade="7F"/>
     </w:rPr>
   </w:style>
-  <w:style w:type="paragraph" w:styleId="Heading7">
+  <w:style w:type="paragraph" w:styleId="Balk7">
     <w:name w:val="heading 7"/>
     <w:basedOn w:val="Normal"/>
     <w:next w:val="Normal"/>
-    <w:link w:val="Heading7Char"/>
+    <w:link w:val="Balk7Char"/>
     <w:uiPriority w:val="9"/>
     <w:semiHidden/>
     <w:unhideWhenUsed/>
@@ -5765,11 +5777,11 @@
       <w:color w:val="404040" w:themeColor="text1" w:themeTint="BF"/>
     </w:rPr>
   </w:style>
-  <w:style w:type="paragraph" w:styleId="Heading8">
+  <w:style w:type="paragraph" w:styleId="Balk8">
     <w:name w:val="heading 8"/>
     <w:basedOn w:val="Normal"/>
     <w:next w:val="Normal"/>
-    <w:link w:val="Heading8Char"/>
+    <w:link w:val="Balk8Char"/>
     <w:uiPriority w:val="9"/>
     <w:semiHidden/>
     <w:unhideWhenUsed/>
@@ -5788,11 +5800,11 @@
       <w:szCs w:val="20"/>
     </w:rPr>
   </w:style>
-  <w:style w:type="paragraph" w:styleId="Heading9">
+  <w:style w:type="paragraph" w:styleId="Balk9">
     <w:name w:val="heading 9"/>
     <w:basedOn w:val="Normal"/>
     <w:next w:val="Normal"/>
-    <w:link w:val="Heading9Char"/>
+    <w:link w:val="Balk9Char"/>
     <w:uiPriority w:val="9"/>
     <w:semiHidden/>
     <w:unhideWhenUsed/>
@@ -5813,12 +5825,13 @@
       <w:szCs w:val="20"/>
     </w:rPr>
   </w:style>
-  <w:style w:type="character" w:default="1" w:styleId="DefaultParagraphFont">
+  <w:style w:type="character" w:default="1" w:styleId="VarsaylanParagrafYazTipi">
     <w:name w:val="Default Paragraph Font"/>
     <w:uiPriority w:val="1"/>
+    <w:semiHidden/>
     <w:unhideWhenUsed/>
   </w:style>
-  <w:style w:type="table" w:default="1" w:styleId="TableNormal">
+  <w:style w:type="table" w:default="1" w:styleId="NormalTablo">
     <w:name w:val="Normal Table"/>
     <w:uiPriority w:val="99"/>
     <w:semiHidden/>
@@ -5833,16 +5846,16 @@
       </w:tblCellMar>
     </w:tblPr>
   </w:style>
-  <w:style w:type="numbering" w:default="1" w:styleId="NoList">
+  <w:style w:type="numbering" w:default="1" w:styleId="ListeYok">
     <w:name w:val="No List"/>
     <w:uiPriority w:val="99"/>
     <w:semiHidden/>
     <w:unhideWhenUsed/>
   </w:style>
-  <w:style w:type="paragraph" w:styleId="Header">
+  <w:style w:type="paragraph" w:styleId="stBilgi">
     <w:name w:val="header"/>
     <w:basedOn w:val="Normal"/>
-    <w:link w:val="HeaderChar"/>
+    <w:link w:val="stBilgiChar"/>
     <w:uiPriority w:val="99"/>
     <w:unhideWhenUsed/>
     <w:rsid w:val="00E618BF"/>
@@ -5854,17 +5867,17 @@
       <w:spacing w:after="0" w:line="240" w:lineRule="auto"/>
     </w:pPr>
   </w:style>
-  <w:style w:type="character" w:customStyle="1" w:styleId="HeaderChar">
-    <w:name w:val="Header Char"/>
-    <w:basedOn w:val="DefaultParagraphFont"/>
-    <w:link w:val="Header"/>
+  <w:style w:type="character" w:customStyle="1" w:styleId="stBilgiChar">
+    <w:name w:val="Üst Bilgi Char"/>
+    <w:basedOn w:val="VarsaylanParagrafYazTipi"/>
+    <w:link w:val="stBilgi"/>
     <w:uiPriority w:val="99"/>
     <w:rsid w:val="00E618BF"/>
   </w:style>
-  <w:style w:type="paragraph" w:styleId="Footer">
+  <w:style w:type="paragraph" w:styleId="AltBilgi">
     <w:name w:val="footer"/>
     <w:basedOn w:val="Normal"/>
-    <w:link w:val="FooterChar"/>
+    <w:link w:val="AltBilgiChar"/>
     <w:uiPriority w:val="99"/>
     <w:unhideWhenUsed/>
     <w:rsid w:val="00E618BF"/>
@@ -5876,14 +5889,14 @@
       <w:spacing w:after="0" w:line="240" w:lineRule="auto"/>
     </w:pPr>
   </w:style>
-  <w:style w:type="character" w:customStyle="1" w:styleId="FooterChar">
-    <w:name w:val="Footer Char"/>
-    <w:basedOn w:val="DefaultParagraphFont"/>
-    <w:link w:val="Footer"/>
+  <w:style w:type="character" w:customStyle="1" w:styleId="AltBilgiChar">
+    <w:name w:val="Alt Bilgi Char"/>
+    <w:basedOn w:val="VarsaylanParagrafYazTipi"/>
+    <w:link w:val="AltBilgi"/>
     <w:uiPriority w:val="99"/>
     <w:rsid w:val="00E618BF"/>
   </w:style>
-  <w:style w:type="paragraph" w:styleId="NoSpacing">
+  <w:style w:type="paragraph" w:styleId="AralkYok">
     <w:name w:val="No Spacing"/>
     <w:uiPriority w:val="1"/>
     <w:qFormat/>
@@ -5892,10 +5905,10 @@
       <w:spacing w:after="0" w:line="240" w:lineRule="auto"/>
     </w:pPr>
   </w:style>
-  <w:style w:type="character" w:customStyle="1" w:styleId="Heading1Char">
-    <w:name w:val="Heading 1 Char"/>
-    <w:basedOn w:val="DefaultParagraphFont"/>
-    <w:link w:val="Heading1"/>
+  <w:style w:type="character" w:customStyle="1" w:styleId="Balk1Char">
+    <w:name w:val="Başlık 1 Char"/>
+    <w:basedOn w:val="VarsaylanParagrafYazTipi"/>
+    <w:link w:val="Balk1"/>
     <w:uiPriority w:val="9"/>
     <w:rsid w:val="00FC693F"/>
     <w:rPr>
@@ -5907,10 +5920,10 @@
       <w:szCs w:val="28"/>
     </w:rPr>
   </w:style>
-  <w:style w:type="character" w:customStyle="1" w:styleId="Heading2Char">
-    <w:name w:val="Heading 2 Char"/>
-    <w:basedOn w:val="DefaultParagraphFont"/>
-    <w:link w:val="Heading2"/>
+  <w:style w:type="character" w:customStyle="1" w:styleId="Balk2Char">
+    <w:name w:val="Başlık 2 Char"/>
+    <w:basedOn w:val="VarsaylanParagrafYazTipi"/>
+    <w:link w:val="Balk2"/>
     <w:uiPriority w:val="9"/>
     <w:rsid w:val="00FC693F"/>
     <w:rPr>
@@ -5922,10 +5935,10 @@
       <w:szCs w:val="26"/>
     </w:rPr>
   </w:style>
-  <w:style w:type="character" w:customStyle="1" w:styleId="Heading3Char">
-    <w:name w:val="Heading 3 Char"/>
-    <w:basedOn w:val="DefaultParagraphFont"/>
-    <w:link w:val="Heading3"/>
+  <w:style w:type="character" w:customStyle="1" w:styleId="Balk3Char">
+    <w:name w:val="Başlık 3 Char"/>
+    <w:basedOn w:val="VarsaylanParagrafYazTipi"/>
+    <w:link w:val="Balk3"/>
     <w:uiPriority w:val="9"/>
     <w:rsid w:val="00FC693F"/>
     <w:rPr>
@@ -5935,11 +5948,11 @@
       <w:color w:val="4F81BD" w:themeColor="accent1"/>
     </w:rPr>
   </w:style>
-  <w:style w:type="paragraph" w:styleId="Title">
+  <w:style w:type="paragraph" w:styleId="KonuBal">
     <w:name w:val="Title"/>
     <w:basedOn w:val="Normal"/>
     <w:next w:val="Normal"/>
-    <w:link w:val="TitleChar"/>
+    <w:link w:val="KonuBalChar"/>
     <w:uiPriority w:val="10"/>
     <w:qFormat/>
     <w:rsid w:val="00FC693F"/>
@@ -5959,10 +5972,10 @@
       <w:szCs w:val="52"/>
     </w:rPr>
   </w:style>
-  <w:style w:type="character" w:customStyle="1" w:styleId="TitleChar">
-    <w:name w:val="Title Char"/>
-    <w:basedOn w:val="DefaultParagraphFont"/>
-    <w:link w:val="Title"/>
+  <w:style w:type="character" w:customStyle="1" w:styleId="KonuBalChar">
+    <w:name w:val="Konu Başlığı Char"/>
+    <w:basedOn w:val="VarsaylanParagrafYazTipi"/>
+    <w:link w:val="KonuBal"/>
     <w:uiPriority w:val="10"/>
     <w:rsid w:val="00FC693F"/>
     <w:rPr>
@@ -5974,11 +5987,11 @@
       <w:szCs w:val="52"/>
     </w:rPr>
   </w:style>
-  <w:style w:type="paragraph" w:styleId="Subtitle">
+  <w:style w:type="paragraph" w:styleId="Altyaz">
     <w:name w:val="Subtitle"/>
     <w:basedOn w:val="Normal"/>
     <w:next w:val="Normal"/>
-    <w:link w:val="SubtitleChar"/>
+    <w:link w:val="AltyazChar"/>
     <w:uiPriority w:val="11"/>
     <w:qFormat/>
     <w:rsid w:val="00FC693F"/>
@@ -5997,10 +6010,10 @@
       <w:szCs w:val="24"/>
     </w:rPr>
   </w:style>
-  <w:style w:type="character" w:customStyle="1" w:styleId="SubtitleChar">
-    <w:name w:val="Subtitle Char"/>
-    <w:basedOn w:val="DefaultParagraphFont"/>
-    <w:link w:val="Subtitle"/>
+  <w:style w:type="character" w:customStyle="1" w:styleId="AltyazChar">
+    <w:name w:val="Altyazı Char"/>
+    <w:basedOn w:val="VarsaylanParagrafYazTipi"/>
+    <w:link w:val="Altyaz"/>
     <w:uiPriority w:val="11"/>
     <w:rsid w:val="00FC693F"/>
     <w:rPr>
@@ -6013,7 +6026,7 @@
       <w:szCs w:val="24"/>
     </w:rPr>
   </w:style>
-  <w:style w:type="paragraph" w:styleId="ListParagraph">
+  <w:style w:type="paragraph" w:styleId="ListeParagraf">
     <w:name w:val="List Paragraph"/>
     <w:basedOn w:val="Normal"/>
     <w:uiPriority w:val="34"/>
@@ -6024,10 +6037,10 @@
       <w:contextualSpacing/>
     </w:pPr>
   </w:style>
-  <w:style w:type="paragraph" w:styleId="BodyText">
+  <w:style w:type="paragraph" w:styleId="GvdeMetni">
     <w:name w:val="Body Text"/>
     <w:basedOn w:val="Normal"/>
-    <w:link w:val="BodyTextChar"/>
+    <w:link w:val="GvdeMetniChar"/>
     <w:uiPriority w:val="99"/>
     <w:unhideWhenUsed/>
     <w:rsid w:val="00AA1D8D"/>
@@ -6035,17 +6048,17 @@
       <w:spacing w:after="120"/>
     </w:pPr>
   </w:style>
-  <w:style w:type="character" w:customStyle="1" w:styleId="BodyTextChar">
-    <w:name w:val="Body Text Char"/>
-    <w:basedOn w:val="DefaultParagraphFont"/>
-    <w:link w:val="BodyText"/>
+  <w:style w:type="character" w:customStyle="1" w:styleId="GvdeMetniChar">
+    <w:name w:val="Gövde Metni Char"/>
+    <w:basedOn w:val="VarsaylanParagrafYazTipi"/>
+    <w:link w:val="GvdeMetni"/>
     <w:uiPriority w:val="99"/>
     <w:rsid w:val="00AA1D8D"/>
   </w:style>
-  <w:style w:type="paragraph" w:styleId="BodyText2">
+  <w:style w:type="paragraph" w:styleId="GvdeMetni2">
     <w:name w:val="Body Text 2"/>
     <w:basedOn w:val="Normal"/>
-    <w:link w:val="BodyText2Char"/>
+    <w:link w:val="GvdeMetni2Char"/>
     <w:uiPriority w:val="99"/>
     <w:unhideWhenUsed/>
     <w:rsid w:val="00AA1D8D"/>
@@ -6053,17 +6066,17 @@
       <w:spacing w:after="120" w:line="480" w:lineRule="auto"/>
     </w:pPr>
   </w:style>
-  <w:style w:type="character" w:customStyle="1" w:styleId="BodyText2Char">
-    <w:name w:val="Body Text 2 Char"/>
-    <w:basedOn w:val="DefaultParagraphFont"/>
-    <w:link w:val="BodyText2"/>
+  <w:style w:type="character" w:customStyle="1" w:styleId="GvdeMetni2Char">
+    <w:name w:val="Gövde Metni 2 Char"/>
+    <w:basedOn w:val="VarsaylanParagrafYazTipi"/>
+    <w:link w:val="GvdeMetni2"/>
     <w:uiPriority w:val="99"/>
     <w:rsid w:val="00AA1D8D"/>
   </w:style>
-  <w:style w:type="paragraph" w:styleId="BodyText3">
+  <w:style w:type="paragraph" w:styleId="GvdeMetni3">
     <w:name w:val="Body Text 3"/>
     <w:basedOn w:val="Normal"/>
-    <w:link w:val="BodyText3Char"/>
+    <w:link w:val="GvdeMetni3Char"/>
     <w:uiPriority w:val="99"/>
     <w:unhideWhenUsed/>
     <w:rsid w:val="00AA1D8D"/>
@@ -6075,10 +6088,10 @@
       <w:szCs w:val="16"/>
     </w:rPr>
   </w:style>
-  <w:style w:type="character" w:customStyle="1" w:styleId="BodyText3Char">
-    <w:name w:val="Body Text 3 Char"/>
-    <w:basedOn w:val="DefaultParagraphFont"/>
-    <w:link w:val="BodyText3"/>
+  <w:style w:type="character" w:customStyle="1" w:styleId="GvdeMetni3Char">
+    <w:name w:val="Gövde Metni 3 Char"/>
+    <w:basedOn w:val="VarsaylanParagrafYazTipi"/>
+    <w:link w:val="GvdeMetni3"/>
     <w:uiPriority w:val="99"/>
     <w:rsid w:val="00AA1D8D"/>
     <w:rPr>
@@ -6086,7 +6099,7 @@
       <w:szCs w:val="16"/>
     </w:rPr>
   </w:style>
-  <w:style w:type="paragraph" w:styleId="List">
+  <w:style w:type="paragraph" w:styleId="Liste">
     <w:name w:val="List"/>
     <w:basedOn w:val="Normal"/>
     <w:uiPriority w:val="99"/>
@@ -6097,7 +6110,7 @@
       <w:contextualSpacing/>
     </w:pPr>
   </w:style>
-  <w:style w:type="paragraph" w:styleId="List2">
+  <w:style w:type="paragraph" w:styleId="Liste2">
     <w:name w:val="List 2"/>
     <w:basedOn w:val="Normal"/>
     <w:uiPriority w:val="99"/>
@@ -6108,7 +6121,7 @@
       <w:contextualSpacing/>
     </w:pPr>
   </w:style>
-  <w:style w:type="paragraph" w:styleId="List3">
+  <w:style w:type="paragraph" w:styleId="Liste3">
     <w:name w:val="List 3"/>
     <w:basedOn w:val="Normal"/>
     <w:uiPriority w:val="99"/>
@@ -6119,7 +6132,7 @@
       <w:contextualSpacing/>
     </w:pPr>
   </w:style>
-  <w:style w:type="paragraph" w:styleId="ListBullet">
+  <w:style w:type="paragraph" w:styleId="ListeMaddemi">
     <w:name w:val="List Bullet"/>
     <w:basedOn w:val="Normal"/>
     <w:uiPriority w:val="99"/>
@@ -6132,7 +6145,7 @@
       <w:contextualSpacing/>
     </w:pPr>
   </w:style>
-  <w:style w:type="paragraph" w:styleId="ListBullet2">
+  <w:style w:type="paragraph" w:styleId="ListeMaddemi2">
     <w:name w:val="List Bullet 2"/>
     <w:basedOn w:val="Normal"/>
     <w:uiPriority w:val="99"/>
@@ -6145,7 +6158,7 @@
       <w:contextualSpacing/>
     </w:pPr>
   </w:style>
-  <w:style w:type="paragraph" w:styleId="ListBullet3">
+  <w:style w:type="paragraph" w:styleId="ListeMaddemi3">
     <w:name w:val="List Bullet 3"/>
     <w:basedOn w:val="Normal"/>
     <w:uiPriority w:val="99"/>
@@ -6158,7 +6171,7 @@
       <w:contextualSpacing/>
     </w:pPr>
   </w:style>
-  <w:style w:type="paragraph" w:styleId="ListNumber">
+  <w:style w:type="paragraph" w:styleId="ListeNumaras">
     <w:name w:val="List Number"/>
     <w:basedOn w:val="Normal"/>
     <w:uiPriority w:val="99"/>
@@ -6171,7 +6184,7 @@
       <w:contextualSpacing/>
     </w:pPr>
   </w:style>
-  <w:style w:type="paragraph" w:styleId="ListNumber2">
+  <w:style w:type="paragraph" w:styleId="ListeNumaras2">
     <w:name w:val="List Number 2"/>
     <w:basedOn w:val="Normal"/>
     <w:uiPriority w:val="99"/>
@@ -6184,7 +6197,7 @@
       <w:contextualSpacing/>
     </w:pPr>
   </w:style>
-  <w:style w:type="paragraph" w:styleId="ListNumber3">
+  <w:style w:type="paragraph" w:styleId="ListeNumaras3">
     <w:name w:val="List Number 3"/>
     <w:basedOn w:val="Normal"/>
     <w:uiPriority w:val="99"/>
@@ -6197,7 +6210,7 @@
       <w:contextualSpacing/>
     </w:pPr>
   </w:style>
-  <w:style w:type="paragraph" w:styleId="ListContinue">
+  <w:style w:type="paragraph" w:styleId="ListeDevam">
     <w:name w:val="List Continue"/>
     <w:basedOn w:val="Normal"/>
     <w:uiPriority w:val="99"/>
@@ -6209,7 +6222,7 @@
       <w:contextualSpacing/>
     </w:pPr>
   </w:style>
-  <w:style w:type="paragraph" w:styleId="ListContinue2">
+  <w:style w:type="paragraph" w:styleId="ListeDevam2">
     <w:name w:val="List Continue 2"/>
     <w:basedOn w:val="Normal"/>
     <w:uiPriority w:val="99"/>
@@ -6221,7 +6234,7 @@
       <w:contextualSpacing/>
     </w:pPr>
   </w:style>
-  <w:style w:type="paragraph" w:styleId="ListContinue3">
+  <w:style w:type="paragraph" w:styleId="ListeDevam3">
     <w:name w:val="List Continue 3"/>
     <w:basedOn w:val="Normal"/>
     <w:uiPriority w:val="99"/>
@@ -6233,9 +6246,9 @@
       <w:contextualSpacing/>
     </w:pPr>
   </w:style>
-  <w:style w:type="paragraph" w:styleId="MacroText">
+  <w:style w:type="paragraph" w:styleId="MakroMetni">
     <w:name w:val="macro"/>
-    <w:link w:val="MacroTextChar"/>
+    <w:link w:val="MakroMetniChar"/>
     <w:uiPriority w:val="99"/>
     <w:unhideWhenUsed/>
     <w:rsid w:val="0029639D"/>
@@ -6256,10 +6269,10 @@
       <w:szCs w:val="20"/>
     </w:rPr>
   </w:style>
-  <w:style w:type="character" w:customStyle="1" w:styleId="MacroTextChar">
-    <w:name w:val="Macro Text Char"/>
-    <w:basedOn w:val="DefaultParagraphFont"/>
-    <w:link w:val="MacroText"/>
+  <w:style w:type="character" w:customStyle="1" w:styleId="MakroMetniChar">
+    <w:name w:val="Makro Metni Char"/>
+    <w:basedOn w:val="VarsaylanParagrafYazTipi"/>
+    <w:link w:val="MakroMetni"/>
     <w:uiPriority w:val="99"/>
     <w:rsid w:val="0029639D"/>
     <w:rPr>
@@ -6268,11 +6281,11 @@
       <w:szCs w:val="20"/>
     </w:rPr>
   </w:style>
-  <w:style w:type="paragraph" w:styleId="Quote">
+  <w:style w:type="paragraph" w:styleId="Alnt">
     <w:name w:val="Quote"/>
     <w:basedOn w:val="Normal"/>
     <w:next w:val="Normal"/>
-    <w:link w:val="QuoteChar"/>
+    <w:link w:val="AlntChar"/>
     <w:uiPriority w:val="29"/>
     <w:qFormat/>
     <w:rsid w:val="00FC693F"/>
@@ -6282,10 +6295,10 @@
       <w:color w:val="000000" w:themeColor="text1"/>
     </w:rPr>
   </w:style>
-  <w:style w:type="character" w:customStyle="1" w:styleId="QuoteChar">
-    <w:name w:val="Quote Char"/>
-    <w:basedOn w:val="DefaultParagraphFont"/>
-    <w:link w:val="Quote"/>
+  <w:style w:type="character" w:customStyle="1" w:styleId="AlntChar">
+    <w:name w:val="Alıntı Char"/>
+    <w:basedOn w:val="VarsaylanParagrafYazTipi"/>
+    <w:link w:val="Alnt"/>
     <w:uiPriority w:val="29"/>
     <w:rsid w:val="00FC693F"/>
     <w:rPr>
@@ -6294,10 +6307,10 @@
       <w:color w:val="000000" w:themeColor="text1"/>
     </w:rPr>
   </w:style>
-  <w:style w:type="character" w:customStyle="1" w:styleId="Heading4Char">
-    <w:name w:val="Heading 4 Char"/>
-    <w:basedOn w:val="DefaultParagraphFont"/>
-    <w:link w:val="Heading4"/>
+  <w:style w:type="character" w:customStyle="1" w:styleId="Balk4Char">
+    <w:name w:val="Başlık 4 Char"/>
+    <w:basedOn w:val="VarsaylanParagrafYazTipi"/>
+    <w:link w:val="Balk4"/>
     <w:uiPriority w:val="9"/>
     <w:semiHidden/>
     <w:rsid w:val="00FC693F"/>
@@ -6310,10 +6323,10 @@
       <w:color w:val="4F81BD" w:themeColor="accent1"/>
     </w:rPr>
   </w:style>
-  <w:style w:type="character" w:customStyle="1" w:styleId="Heading5Char">
-    <w:name w:val="Heading 5 Char"/>
-    <w:basedOn w:val="DefaultParagraphFont"/>
-    <w:link w:val="Heading5"/>
+  <w:style w:type="character" w:customStyle="1" w:styleId="Balk5Char">
+    <w:name w:val="Başlık 5 Char"/>
+    <w:basedOn w:val="VarsaylanParagrafYazTipi"/>
+    <w:link w:val="Balk5"/>
     <w:uiPriority w:val="9"/>
     <w:semiHidden/>
     <w:rsid w:val="00FC693F"/>
@@ -6322,10 +6335,10 @@
       <w:color w:val="243F60" w:themeColor="accent1" w:themeShade="7F"/>
     </w:rPr>
   </w:style>
-  <w:style w:type="character" w:customStyle="1" w:styleId="Heading6Char">
-    <w:name w:val="Heading 6 Char"/>
-    <w:basedOn w:val="DefaultParagraphFont"/>
-    <w:link w:val="Heading6"/>
+  <w:style w:type="character" w:customStyle="1" w:styleId="Balk6Char">
+    <w:name w:val="Başlık 6 Char"/>
+    <w:basedOn w:val="VarsaylanParagrafYazTipi"/>
+    <w:link w:val="Balk6"/>
     <w:uiPriority w:val="9"/>
     <w:semiHidden/>
     <w:rsid w:val="00FC693F"/>
@@ -6336,10 +6349,10 @@
       <w:color w:val="243F60" w:themeColor="accent1" w:themeShade="7F"/>
     </w:rPr>
   </w:style>
-  <w:style w:type="character" w:customStyle="1" w:styleId="Heading7Char">
-    <w:name w:val="Heading 7 Char"/>
-    <w:basedOn w:val="DefaultParagraphFont"/>
-    <w:link w:val="Heading7"/>
+  <w:style w:type="character" w:customStyle="1" w:styleId="Balk7Char">
+    <w:name w:val="Başlık 7 Char"/>
+    <w:basedOn w:val="VarsaylanParagrafYazTipi"/>
+    <w:link w:val="Balk7"/>
     <w:uiPriority w:val="9"/>
     <w:semiHidden/>
     <w:rsid w:val="00FC693F"/>
@@ -6350,10 +6363,10 @@
       <w:color w:val="404040" w:themeColor="text1" w:themeTint="BF"/>
     </w:rPr>
   </w:style>
-  <w:style w:type="character" w:customStyle="1" w:styleId="Heading8Char">
-    <w:name w:val="Heading 8 Char"/>
-    <w:basedOn w:val="DefaultParagraphFont"/>
-    <w:link w:val="Heading8"/>
+  <w:style w:type="character" w:customStyle="1" w:styleId="Balk8Char">
+    <w:name w:val="Başlık 8 Char"/>
+    <w:basedOn w:val="VarsaylanParagrafYazTipi"/>
+    <w:link w:val="Balk8"/>
     <w:uiPriority w:val="9"/>
     <w:semiHidden/>
     <w:rsid w:val="00FC693F"/>
@@ -6364,10 +6377,10 @@
       <w:szCs w:val="20"/>
     </w:rPr>
   </w:style>
-  <w:style w:type="character" w:customStyle="1" w:styleId="Heading9Char">
-    <w:name w:val="Heading 9 Char"/>
-    <w:basedOn w:val="DefaultParagraphFont"/>
-    <w:link w:val="Heading9"/>
+  <w:style w:type="character" w:customStyle="1" w:styleId="Balk9Char">
+    <w:name w:val="Başlık 9 Char"/>
+    <w:basedOn w:val="VarsaylanParagrafYazTipi"/>
+    <w:link w:val="Balk9"/>
     <w:uiPriority w:val="9"/>
     <w:semiHidden/>
     <w:rsid w:val="00FC693F"/>
@@ -6380,7 +6393,7 @@
       <w:szCs w:val="20"/>
     </w:rPr>
   </w:style>
-  <w:style w:type="paragraph" w:styleId="Caption">
+  <w:style w:type="paragraph" w:styleId="ResimYazs">
     <w:name w:val="caption"/>
     <w:basedOn w:val="Normal"/>
     <w:next w:val="Normal"/>
@@ -6400,9 +6413,9 @@
       <w:szCs w:val="18"/>
     </w:rPr>
   </w:style>
-  <w:style w:type="character" w:styleId="Strong">
+  <w:style w:type="character" w:styleId="Gl">
     <w:name w:val="Strong"/>
-    <w:basedOn w:val="DefaultParagraphFont"/>
+    <w:basedOn w:val="VarsaylanParagrafYazTipi"/>
     <w:qFormat/>
     <w:rsid w:val="00FC693F"/>
     <w:rPr>
@@ -6410,9 +6423,9 @@
       <w:bCs/>
     </w:rPr>
   </w:style>
-  <w:style w:type="character" w:styleId="Emphasis">
+  <w:style w:type="character" w:styleId="Vurgu">
     <w:name w:val="Emphasis"/>
-    <w:basedOn w:val="DefaultParagraphFont"/>
+    <w:basedOn w:val="VarsaylanParagrafYazTipi"/>
     <w:uiPriority w:val="20"/>
     <w:qFormat/>
     <w:rsid w:val="00FC693F"/>
@@ -6421,11 +6434,11 @@
       <w:iCs/>
     </w:rPr>
   </w:style>
-  <w:style w:type="paragraph" w:styleId="IntenseQuote">
+  <w:style w:type="paragraph" w:styleId="GlAlnt">
     <w:name w:val="Intense Quote"/>
     <w:basedOn w:val="Normal"/>
     <w:next w:val="Normal"/>
-    <w:link w:val="IntenseQuoteChar"/>
+    <w:link w:val="GlAlntChar"/>
     <w:uiPriority w:val="30"/>
     <w:qFormat/>
     <w:rsid w:val="00FC693F"/>
@@ -6444,10 +6457,10 @@
       <w:color w:val="4F81BD" w:themeColor="accent1"/>
     </w:rPr>
   </w:style>
-  <w:style w:type="character" w:customStyle="1" w:styleId="IntenseQuoteChar">
-    <w:name w:val="Intense Quote Char"/>
-    <w:basedOn w:val="DefaultParagraphFont"/>
-    <w:link w:val="IntenseQuote"/>
+  <w:style w:type="character" w:customStyle="1" w:styleId="GlAlntChar">
+    <w:name w:val="Güçlü Alıntı Char"/>
+    <w:basedOn w:val="VarsaylanParagrafYazTipi"/>
+    <w:link w:val="GlAlnt"/>
     <w:uiPriority w:val="30"/>
     <w:rsid w:val="00FC693F"/>
     <w:rPr>
@@ -6458,9 +6471,9 @@
       <w:color w:val="4F81BD" w:themeColor="accent1"/>
     </w:rPr>
   </w:style>
-  <w:style w:type="character" w:styleId="SubtleEmphasis">
+  <w:style w:type="character" w:styleId="HafifVurgulama">
     <w:name w:val="Subtle Emphasis"/>
-    <w:basedOn w:val="DefaultParagraphFont"/>
+    <w:basedOn w:val="VarsaylanParagrafYazTipi"/>
     <w:uiPriority w:val="19"/>
     <w:qFormat/>
     <w:rsid w:val="00FC693F"/>
@@ -6470,9 +6483,9 @@
       <w:color w:val="808080" w:themeColor="text1" w:themeTint="7F"/>
     </w:rPr>
   </w:style>
-  <w:style w:type="character" w:styleId="IntenseEmphasis">
+  <w:style w:type="character" w:styleId="GlVurgulama">
     <w:name w:val="Intense Emphasis"/>
-    <w:basedOn w:val="DefaultParagraphFont"/>
+    <w:basedOn w:val="VarsaylanParagrafYazTipi"/>
     <w:uiPriority w:val="21"/>
     <w:qFormat/>
     <w:rsid w:val="00FC693F"/>
@@ -6484,9 +6497,9 @@
       <w:color w:val="4F81BD" w:themeColor="accent1"/>
     </w:rPr>
   </w:style>
-  <w:style w:type="character" w:styleId="SubtleReference">
+  <w:style w:type="character" w:styleId="HafifBavuru">
     <w:name w:val="Subtle Reference"/>
-    <w:basedOn w:val="DefaultParagraphFont"/>
+    <w:basedOn w:val="VarsaylanParagrafYazTipi"/>
     <w:uiPriority w:val="31"/>
     <w:qFormat/>
     <w:rsid w:val="00FC693F"/>
@@ -6496,9 +6509,9 @@
       <w:u w:val="single"/>
     </w:rPr>
   </w:style>
-  <w:style w:type="character" w:styleId="IntenseReference">
+  <w:style w:type="character" w:styleId="GlBavuru">
     <w:name w:val="Intense Reference"/>
-    <w:basedOn w:val="DefaultParagraphFont"/>
+    <w:basedOn w:val="VarsaylanParagrafYazTipi"/>
     <w:uiPriority w:val="32"/>
     <w:qFormat/>
     <w:rsid w:val="00FC693F"/>
@@ -6511,9 +6524,9 @@
       <w:u w:val="single"/>
     </w:rPr>
   </w:style>
-  <w:style w:type="character" w:styleId="BookTitle">
+  <w:style w:type="character" w:styleId="KitapBal">
     <w:name w:val="Book Title"/>
-    <w:basedOn w:val="DefaultParagraphFont"/>
+    <w:basedOn w:val="VarsaylanParagrafYazTipi"/>
     <w:uiPriority w:val="33"/>
     <w:qFormat/>
     <w:rsid w:val="00FC693F"/>
@@ -6524,9 +6537,9 @@
       <w:spacing w:val="5"/>
     </w:rPr>
   </w:style>
-  <w:style w:type="paragraph" w:styleId="TOCHeading">
+  <w:style w:type="paragraph" w:styleId="TBal">
     <w:name w:val="TOC Heading"/>
-    <w:basedOn w:val="Heading1"/>
+    <w:basedOn w:val="Balk1"/>
     <w:next w:val="Normal"/>
     <w:uiPriority w:val="39"/>
     <w:semiHidden/>
@@ -6537,9 +6550,9 @@
       <w:outlineLvl w:val="9"/>
     </w:pPr>
   </w:style>
-  <w:style w:type="table" w:styleId="TableGrid">
+  <w:style w:type="table" w:styleId="TabloKlavuzu">
     <w:name w:val="Table Grid"/>
-    <w:basedOn w:val="TableNormal"/>
+    <w:basedOn w:val="NormalTablo"/>
     <w:uiPriority w:val="59"/>
     <w:rsid w:val="00FC693F"/>
     <w:pPr>
@@ -6556,9 +6569,9 @@
       </w:tblBorders>
     </w:tblPr>
   </w:style>
-  <w:style w:type="table" w:styleId="LightShading">
+  <w:style w:type="table" w:styleId="AkGlgeleme">
     <w:name w:val="Light Shading"/>
-    <w:basedOn w:val="TableNormal"/>
+    <w:basedOn w:val="NormalTablo"/>
     <w:uiPriority w:val="60"/>
     <w:rsid w:val="00FC693F"/>
     <w:pPr>
@@ -6652,9 +6665,9 @@
       </w:tcPr>
     </w:tblStylePr>
   </w:style>
-  <w:style w:type="table" w:styleId="LightShading-Accent1">
+  <w:style w:type="table" w:styleId="AkGlgeleme-Vurgu1">
     <w:name w:val="Light Shading Accent 1"/>
-    <w:basedOn w:val="TableNormal"/>
+    <w:basedOn w:val="NormalTablo"/>
     <w:uiPriority w:val="60"/>
     <w:rsid w:val="00FC693F"/>
     <w:pPr>
@@ -6748,9 +6761,9 @@
       </w:tcPr>
     </w:tblStylePr>
   </w:style>
-  <w:style w:type="table" w:styleId="LightShading-Accent2">
+  <w:style w:type="table" w:styleId="AkGlgeleme-Vurgu2">
     <w:name w:val="Light Shading Accent 2"/>
-    <w:basedOn w:val="TableNormal"/>
+    <w:basedOn w:val="NormalTablo"/>
     <w:uiPriority w:val="60"/>
     <w:rsid w:val="00FC693F"/>
     <w:pPr>
@@ -6844,9 +6857,9 @@
       </w:tcPr>
     </w:tblStylePr>
   </w:style>
-  <w:style w:type="table" w:styleId="LightShading-Accent3">
+  <w:style w:type="table" w:styleId="AkGlgeleme-Vurgu3">
     <w:name w:val="Light Shading Accent 3"/>
-    <w:basedOn w:val="TableNormal"/>
+    <w:basedOn w:val="NormalTablo"/>
     <w:uiPriority w:val="60"/>
     <w:rsid w:val="00FC693F"/>
     <w:pPr>
@@ -6940,9 +6953,9 @@
       </w:tcPr>
     </w:tblStylePr>
   </w:style>
-  <w:style w:type="table" w:styleId="LightShading-Accent4">
+  <w:style w:type="table" w:styleId="AkGlgeleme-Vurgu4">
     <w:name w:val="Light Shading Accent 4"/>
-    <w:basedOn w:val="TableNormal"/>
+    <w:basedOn w:val="NormalTablo"/>
     <w:uiPriority w:val="60"/>
     <w:rsid w:val="00FC693F"/>
     <w:pPr>
@@ -7036,9 +7049,9 @@
       </w:tcPr>
     </w:tblStylePr>
   </w:style>
-  <w:style w:type="table" w:styleId="LightShading-Accent5">
+  <w:style w:type="table" w:styleId="AkGlgeleme-Vurgu5">
     <w:name w:val="Light Shading Accent 5"/>
-    <w:basedOn w:val="TableNormal"/>
+    <w:basedOn w:val="NormalTablo"/>
     <w:uiPriority w:val="60"/>
     <w:rsid w:val="00FC693F"/>
     <w:pPr>
@@ -7132,9 +7145,9 @@
       </w:tcPr>
     </w:tblStylePr>
   </w:style>
-  <w:style w:type="table" w:styleId="LightShading-Accent6">
+  <w:style w:type="table" w:styleId="AkGlgeleme-Vurgu6">
     <w:name w:val="Light Shading Accent 6"/>
-    <w:basedOn w:val="TableNormal"/>
+    <w:basedOn w:val="NormalTablo"/>
     <w:uiPriority w:val="60"/>
     <w:rsid w:val="00FC693F"/>
     <w:pPr>
@@ -7228,9 +7241,9 @@
       </w:tcPr>
     </w:tblStylePr>
   </w:style>
-  <w:style w:type="table" w:styleId="LightList">
+  <w:style w:type="table" w:styleId="AkListe">
     <w:name w:val="Light List"/>
-    <w:basedOn w:val="TableNormal"/>
+    <w:basedOn w:val="NormalTablo"/>
     <w:uiPriority w:val="61"/>
     <w:rsid w:val="00FC693F"/>
     <w:pPr>
@@ -7313,9 +7326,9 @@
       </w:tcPr>
     </w:tblStylePr>
   </w:style>
-  <w:style w:type="table" w:styleId="LightList-Accent1">
+  <w:style w:type="table" w:styleId="AkListe-Vurgu1">
     <w:name w:val="Light List Accent 1"/>
-    <w:basedOn w:val="TableNormal"/>
+    <w:basedOn w:val="NormalTablo"/>
     <w:uiPriority w:val="61"/>
     <w:rsid w:val="00FC693F"/>
     <w:pPr>
@@ -7398,9 +7411,9 @@
       </w:tcPr>
     </w:tblStylePr>
   </w:style>
-  <w:style w:type="table" w:styleId="LightList-Accent2">
+  <w:style w:type="table" w:styleId="AkListe-Vurgu2">
     <w:name w:val="Light List Accent 2"/>
-    <w:basedOn w:val="TableNormal"/>
+    <w:basedOn w:val="NormalTablo"/>
     <w:uiPriority w:val="61"/>
     <w:rsid w:val="00CB0664"/>
     <w:pPr>
@@ -7483,9 +7496,9 @@
       </w:tcPr>
     </w:tblStylePr>
   </w:style>
-  <w:style w:type="table" w:styleId="LightList-Accent3">
+  <w:style w:type="table" w:styleId="AkListe-Vurgu3">
     <w:name w:val="Light List Accent 3"/>
-    <w:basedOn w:val="TableNormal"/>
+    <w:basedOn w:val="NormalTablo"/>
     <w:uiPriority w:val="61"/>
     <w:rsid w:val="00CB0664"/>
     <w:pPr>
@@ -7568,9 +7581,9 @@
       </w:tcPr>
     </w:tblStylePr>
   </w:style>
-  <w:style w:type="table" w:styleId="LightList-Accent4">
+  <w:style w:type="table" w:styleId="AkListe-Vurgu4">
     <w:name w:val="Light List Accent 4"/>
-    <w:basedOn w:val="TableNormal"/>
+    <w:basedOn w:val="NormalTablo"/>
     <w:uiPriority w:val="61"/>
     <w:rsid w:val="00CB0664"/>
     <w:pPr>
@@ -7653,9 +7666,9 @@
       </w:tcPr>
     </w:tblStylePr>
   </w:style>
-  <w:style w:type="table" w:styleId="LightList-Accent5">
+  <w:style w:type="table" w:styleId="AkListe-Vurgu5">
     <w:name w:val="Light List Accent 5"/>
-    <w:basedOn w:val="TableNormal"/>
+    <w:basedOn w:val="NormalTablo"/>
     <w:uiPriority w:val="61"/>
     <w:rsid w:val="00CB0664"/>
     <w:pPr>
@@ -7738,9 +7751,9 @@
       </w:tcPr>
     </w:tblStylePr>
   </w:style>
-  <w:style w:type="table" w:styleId="LightList-Accent6">
+  <w:style w:type="table" w:styleId="AkListe-Vurgu6">
     <w:name w:val="Light List Accent 6"/>
-    <w:basedOn w:val="TableNormal"/>
+    <w:basedOn w:val="NormalTablo"/>
     <w:uiPriority w:val="61"/>
     <w:rsid w:val="00CB0664"/>
     <w:pPr>
@@ -7823,9 +7836,9 @@
       </w:tcPr>
     </w:tblStylePr>
   </w:style>
-  <w:style w:type="table" w:styleId="LightGrid">
+  <w:style w:type="table" w:styleId="AkKlavuz">
     <w:name w:val="Light Grid"/>
-    <w:basedOn w:val="TableNormal"/>
+    <w:basedOn w:val="NormalTablo"/>
     <w:uiPriority w:val="62"/>
     <w:rsid w:val="00CB0664"/>
     <w:pPr>
@@ -7946,9 +7959,9 @@
       </w:tcPr>
     </w:tblStylePr>
   </w:style>
-  <w:style w:type="table" w:styleId="LightGrid-Accent1">
+  <w:style w:type="table" w:styleId="AkKlavuz-Vurgu1">
     <w:name w:val="Light Grid Accent 1"/>
-    <w:basedOn w:val="TableNormal"/>
+    <w:basedOn w:val="NormalTablo"/>
     <w:uiPriority w:val="62"/>
     <w:rsid w:val="00CB0664"/>
     <w:pPr>
@@ -8069,9 +8082,9 @@
       </w:tcPr>
     </w:tblStylePr>
   </w:style>
-  <w:style w:type="table" w:styleId="LightGrid-Accent2">
+  <w:style w:type="table" w:styleId="AkKlavuz-Vurgu2">
     <w:name w:val="Light Grid Accent 2"/>
-    <w:basedOn w:val="TableNormal"/>
+    <w:basedOn w:val="NormalTablo"/>
     <w:uiPriority w:val="62"/>
     <w:rsid w:val="00CB0664"/>
     <w:pPr>
@@ -8192,9 +8205,9 @@
       </w:tcPr>
     </w:tblStylePr>
   </w:style>
-  <w:style w:type="table" w:styleId="LightGrid-Accent3">
+  <w:style w:type="table" w:styleId="AkKlavuz-Vurgu3">
     <w:name w:val="Light Grid Accent 3"/>
-    <w:basedOn w:val="TableNormal"/>
+    <w:basedOn w:val="NormalTablo"/>
     <w:uiPriority w:val="62"/>
     <w:rsid w:val="00CB0664"/>
     <w:pPr>
@@ -8315,9 +8328,9 @@
       </w:tcPr>
     </w:tblStylePr>
   </w:style>
-  <w:style w:type="table" w:styleId="LightGrid-Accent4">
+  <w:style w:type="table" w:styleId="AkKlavuz-Vurgu4">
     <w:name w:val="Light Grid Accent 4"/>
-    <w:basedOn w:val="TableNormal"/>
+    <w:basedOn w:val="NormalTablo"/>
     <w:uiPriority w:val="62"/>
     <w:rsid w:val="00CB0664"/>
     <w:pPr>
@@ -8438,9 +8451,9 @@
       </w:tcPr>
     </w:tblStylePr>
   </w:style>
-  <w:style w:type="table" w:styleId="LightGrid-Accent5">
+  <w:style w:type="table" w:styleId="AkKlavuz-Vurgu5">
     <w:name w:val="Light Grid Accent 5"/>
-    <w:basedOn w:val="TableNormal"/>
+    <w:basedOn w:val="NormalTablo"/>
     <w:uiPriority w:val="62"/>
     <w:rsid w:val="00CB0664"/>
     <w:pPr>
@@ -8561,9 +8574,9 @@
       </w:tcPr>
     </w:tblStylePr>
   </w:style>
-  <w:style w:type="table" w:styleId="LightGrid-Accent6">
+  <w:style w:type="table" w:styleId="AkKlavuz-Vurgu6">
     <w:name w:val="Light Grid Accent 6"/>
-    <w:basedOn w:val="TableNormal"/>
+    <w:basedOn w:val="NormalTablo"/>
     <w:uiPriority w:val="62"/>
     <w:rsid w:val="00CB0664"/>
     <w:pPr>
@@ -8684,9 +8697,9 @@
       </w:tcPr>
     </w:tblStylePr>
   </w:style>
-  <w:style w:type="table" w:styleId="MediumShading1">
+  <w:style w:type="table" w:styleId="OrtaGlgeleme1">
     <w:name w:val="Medium Shading 1"/>
-    <w:basedOn w:val="TableNormal"/>
+    <w:basedOn w:val="NormalTablo"/>
     <w:uiPriority w:val="63"/>
     <w:rsid w:val="00CB0664"/>
     <w:pPr>
@@ -8783,9 +8796,9 @@
       </w:tcPr>
     </w:tblStylePr>
   </w:style>
-  <w:style w:type="table" w:styleId="MediumShading1-Accent1">
+  <w:style w:type="table" w:styleId="OrtaGlgeleme1-Vurgu1">
     <w:name w:val="Medium Shading 1 Accent 1"/>
-    <w:basedOn w:val="TableNormal"/>
+    <w:basedOn w:val="NormalTablo"/>
     <w:uiPriority w:val="63"/>
     <w:rsid w:val="00CB0664"/>
     <w:pPr>
@@ -8882,9 +8895,9 @@
       </w:tcPr>
     </w:tblStylePr>
   </w:style>
-  <w:style w:type="table" w:styleId="MediumShading1-Accent2">
+  <w:style w:type="table" w:styleId="OrtaGlgeleme1-Vurgu2">
     <w:name w:val="Medium Shading 1 Accent 2"/>
-    <w:basedOn w:val="TableNormal"/>
+    <w:basedOn w:val="NormalTablo"/>
     <w:uiPriority w:val="63"/>
     <w:rsid w:val="00CB0664"/>
     <w:pPr>
@@ -8981,9 +8994,9 @@
       </w:tcPr>
     </w:tblStylePr>
   </w:style>
-  <w:style w:type="table" w:styleId="MediumShading1-Accent3">
+  <w:style w:type="table" w:styleId="OrtaGlgeleme1-Vurgu3">
     <w:name w:val="Medium Shading 1 Accent 3"/>
-    <w:basedOn w:val="TableNormal"/>
+    <w:basedOn w:val="NormalTablo"/>
     <w:uiPriority w:val="63"/>
     <w:rsid w:val="00CB0664"/>
     <w:pPr>
@@ -9080,9 +9093,9 @@
       </w:tcPr>
     </w:tblStylePr>
   </w:style>
-  <w:style w:type="table" w:styleId="MediumShading1-Accent4">
+  <w:style w:type="table" w:styleId="OrtaGlgeleme1-Vurgu4">
     <w:name w:val="Medium Shading 1 Accent 4"/>
-    <w:basedOn w:val="TableNormal"/>
+    <w:basedOn w:val="NormalTablo"/>
     <w:uiPriority w:val="63"/>
     <w:rsid w:val="00CB0664"/>
     <w:pPr>
@@ -9179,9 +9192,9 @@
       </w:tcPr>
     </w:tblStylePr>
   </w:style>
-  <w:style w:type="table" w:styleId="MediumShading1-Accent5">
+  <w:style w:type="table" w:styleId="OrtaGlgeleme1-Vurgu5">
     <w:name w:val="Medium Shading 1 Accent 5"/>
-    <w:basedOn w:val="TableNormal"/>
+    <w:basedOn w:val="NormalTablo"/>
     <w:uiPriority w:val="63"/>
     <w:rsid w:val="00CB0664"/>
     <w:pPr>
@@ -9278,9 +9291,9 @@
       </w:tcPr>
     </w:tblStylePr>
   </w:style>
-  <w:style w:type="table" w:styleId="MediumShading1-Accent6">
+  <w:style w:type="table" w:styleId="OrtaGlgeleme1-Vurgu6">
     <w:name w:val="Medium Shading 1 Accent 6"/>
-    <w:basedOn w:val="TableNormal"/>
+    <w:basedOn w:val="NormalTablo"/>
     <w:uiPriority w:val="63"/>
     <w:rsid w:val="00CB0664"/>
     <w:pPr>
@@ -9377,9 +9390,9 @@
       </w:tcPr>
     </w:tblStylePr>
   </w:style>
-  <w:style w:type="table" w:styleId="MediumShading2">
+  <w:style w:type="table" w:styleId="OrtaGlgeleme2">
     <w:name w:val="Medium Shading 2"/>
-    <w:basedOn w:val="TableNormal"/>
+    <w:basedOn w:val="NormalTablo"/>
     <w:uiPriority w:val="64"/>
     <w:rsid w:val="00CB0664"/>
     <w:pPr>
@@ -9519,9 +9532,9 @@
       </w:tcPr>
     </w:tblStylePr>
   </w:style>
-  <w:style w:type="table" w:styleId="MediumShading2-Accent1">
+  <w:style w:type="table" w:styleId="OrtaGlgeleme2-Vurgu1">
     <w:name w:val="Medium Shading 2 Accent 1"/>
-    <w:basedOn w:val="TableNormal"/>
+    <w:basedOn w:val="NormalTablo"/>
     <w:uiPriority w:val="64"/>
     <w:rsid w:val="00CB0664"/>
     <w:pPr>
@@ -9661,9 +9674,9 @@
       </w:tcPr>
     </w:tblStylePr>
   </w:style>
-  <w:style w:type="table" w:styleId="MediumShading2-Accent2">
+  <w:style w:type="table" w:styleId="OrtaGlgeleme2-Vurgu2">
     <w:name w:val="Medium Shading 2 Accent 2"/>
-    <w:basedOn w:val="TableNormal"/>
+    <w:basedOn w:val="NormalTablo"/>
     <w:uiPriority w:val="64"/>
     <w:rsid w:val="00CB0664"/>
     <w:pPr>
@@ -9803,9 +9816,9 @@
       </w:tcPr>
     </w:tblStylePr>
   </w:style>
-  <w:style w:type="table" w:styleId="MediumShading2-Accent3">
+  <w:style w:type="table" w:styleId="OrtaGlgeleme2-Vurgu3">
     <w:name w:val="Medium Shading 2 Accent 3"/>
-    <w:basedOn w:val="TableNormal"/>
+    <w:basedOn w:val="NormalTablo"/>
     <w:uiPriority w:val="64"/>
     <w:rsid w:val="00CB0664"/>
     <w:pPr>
@@ -9945,9 +9958,9 @@
       </w:tcPr>
     </w:tblStylePr>
   </w:style>
-  <w:style w:type="table" w:styleId="MediumShading2-Accent4">
+  <w:style w:type="table" w:styleId="OrtaGlgeleme2-Vurgu4">
     <w:name w:val="Medium Shading 2 Accent 4"/>
-    <w:basedOn w:val="TableNormal"/>
+    <w:basedOn w:val="NormalTablo"/>
     <w:uiPriority w:val="64"/>
     <w:rsid w:val="00CB0664"/>
     <w:pPr>
@@ -10087,9 +10100,9 @@
       </w:tcPr>
     </w:tblStylePr>
   </w:style>
-  <w:style w:type="table" w:styleId="MediumShading2-Accent5">
+  <w:style w:type="table" w:styleId="OrtaGlgeleme2-Vurgu5">
     <w:name w:val="Medium Shading 2 Accent 5"/>
-    <w:basedOn w:val="TableNormal"/>
+    <w:basedOn w:val="NormalTablo"/>
     <w:uiPriority w:val="64"/>
     <w:rsid w:val="00CB0664"/>
     <w:pPr>
@@ -10229,9 +10242,9 @@
       </w:tcPr>
     </w:tblStylePr>
   </w:style>
-  <w:style w:type="table" w:styleId="MediumShading2-Accent6">
+  <w:style w:type="table" w:styleId="OrtaGlgeleme2-Vurgu6">
     <w:name w:val="Medium Shading 2 Accent 6"/>
-    <w:basedOn w:val="TableNormal"/>
+    <w:basedOn w:val="NormalTablo"/>
     <w:uiPriority w:val="64"/>
     <w:rsid w:val="00CB0664"/>
     <w:pPr>
@@ -10371,9 +10384,9 @@
       </w:tcPr>
     </w:tblStylePr>
   </w:style>
-  <w:style w:type="table" w:styleId="MediumList1">
+  <w:style w:type="table" w:styleId="OrtaListe1">
     <w:name w:val="Medium List 1"/>
-    <w:basedOn w:val="TableNormal"/>
+    <w:basedOn w:val="NormalTablo"/>
     <w:uiPriority w:val="65"/>
     <w:rsid w:val="00CB0664"/>
     <w:pPr>
@@ -10448,9 +10461,9 @@
       </w:tcPr>
     </w:tblStylePr>
   </w:style>
-  <w:style w:type="table" w:styleId="MediumList1-Accent1">
+  <w:style w:type="table" w:styleId="OrtaListe1-Vurgu1">
     <w:name w:val="Medium List 1 Accent 1"/>
-    <w:basedOn w:val="TableNormal"/>
+    <w:basedOn w:val="NormalTablo"/>
     <w:uiPriority w:val="65"/>
     <w:rsid w:val="00CB0664"/>
     <w:pPr>
@@ -10525,9 +10538,9 @@
       </w:tcPr>
     </w:tblStylePr>
   </w:style>
-  <w:style w:type="table" w:styleId="MediumList1-Accent2">
+  <w:style w:type="table" w:styleId="OrtaListe1-Vurgu2">
     <w:name w:val="Medium List 1 Accent 2"/>
-    <w:basedOn w:val="TableNormal"/>
+    <w:basedOn w:val="NormalTablo"/>
     <w:uiPriority w:val="65"/>
     <w:rsid w:val="00CB0664"/>
     <w:pPr>
@@ -10602,9 +10615,9 @@
       </w:tcPr>
     </w:tblStylePr>
   </w:style>
-  <w:style w:type="table" w:styleId="MediumList1-Accent3">
+  <w:style w:type="table" w:styleId="OrtaListe1-Vurgu3">
     <w:name w:val="Medium List 1 Accent 3"/>
-    <w:basedOn w:val="TableNormal"/>
+    <w:basedOn w:val="NormalTablo"/>
     <w:uiPriority w:val="65"/>
     <w:rsid w:val="00CB0664"/>
     <w:pPr>
@@ -10679,9 +10692,9 @@
       </w:tcPr>
     </w:tblStylePr>
   </w:style>
-  <w:style w:type="table" w:styleId="MediumList1-Accent4">
+  <w:style w:type="table" w:styleId="OrtaListe1-Vurgu4">
     <w:name w:val="Medium List 1 Accent 4"/>
-    <w:basedOn w:val="TableNormal"/>
+    <w:basedOn w:val="NormalTablo"/>
     <w:uiPriority w:val="65"/>
     <w:rsid w:val="00CB0664"/>
     <w:pPr>
@@ -10756,9 +10769,9 @@
       </w:tcPr>
     </w:tblStylePr>
   </w:style>
-  <w:style w:type="table" w:styleId="MediumList1-Accent5">
+  <w:style w:type="table" w:styleId="OrtaListe1-Vurgu5">
     <w:name w:val="Medium List 1 Accent 5"/>
-    <w:basedOn w:val="TableNormal"/>
+    <w:basedOn w:val="NormalTablo"/>
     <w:uiPriority w:val="65"/>
     <w:rsid w:val="00CB0664"/>
     <w:pPr>
@@ -10833,9 +10846,9 @@
       </w:tcPr>
     </w:tblStylePr>
   </w:style>
-  <w:style w:type="table" w:styleId="MediumList1-Accent6">
+  <w:style w:type="table" w:styleId="OrtaListe1-Vurgu6">
     <w:name w:val="Medium List 1 Accent 6"/>
-    <w:basedOn w:val="TableNormal"/>
+    <w:basedOn w:val="NormalTablo"/>
     <w:uiPriority w:val="65"/>
     <w:rsid w:val="00CB0664"/>
     <w:pPr>
@@ -10910,9 +10923,9 @@
       </w:tcPr>
     </w:tblStylePr>
   </w:style>
-  <w:style w:type="table" w:styleId="MediumList2">
+  <w:style w:type="table" w:styleId="OrtaListe2">
     <w:name w:val="Medium List 2"/>
-    <w:basedOn w:val="TableNormal"/>
+    <w:basedOn w:val="NormalTablo"/>
     <w:uiPriority w:val="66"/>
     <w:rsid w:val="00CB0664"/>
     <w:pPr>
@@ -11031,9 +11044,9 @@
       </w:tcPr>
     </w:tblStylePr>
   </w:style>
-  <w:style w:type="table" w:styleId="MediumList2-Accent1">
+  <w:style w:type="table" w:styleId="OrtaList2-Vurgu1">
     <w:name w:val="Medium List 2 Accent 1"/>
-    <w:basedOn w:val="TableNormal"/>
+    <w:basedOn w:val="NormalTablo"/>
     <w:uiPriority w:val="66"/>
     <w:rsid w:val="00CB0664"/>
     <w:pPr>
@@ -11152,9 +11165,9 @@
       </w:tcPr>
     </w:tblStylePr>
   </w:style>
-  <w:style w:type="table" w:styleId="MediumList2-Accent2">
+  <w:style w:type="table" w:styleId="OrtaListe2-Vurgu2">
     <w:name w:val="Medium List 2 Accent 2"/>
-    <w:basedOn w:val="TableNormal"/>
+    <w:basedOn w:val="NormalTablo"/>
     <w:uiPriority w:val="66"/>
     <w:rsid w:val="00CB0664"/>
     <w:pPr>
@@ -11273,9 +11286,9 @@
       </w:tcPr>
     </w:tblStylePr>
   </w:style>
-  <w:style w:type="table" w:styleId="MediumList2-Accent3">
+  <w:style w:type="table" w:styleId="OrtaListe2-Vurgu3">
     <w:name w:val="Medium List 2 Accent 3"/>
-    <w:basedOn w:val="TableNormal"/>
+    <w:basedOn w:val="NormalTablo"/>
     <w:uiPriority w:val="66"/>
     <w:rsid w:val="00CB0664"/>
     <w:pPr>
@@ -11394,9 +11407,9 @@
       </w:tcPr>
     </w:tblStylePr>
   </w:style>
-  <w:style w:type="table" w:styleId="MediumList2-Accent4">
+  <w:style w:type="table" w:styleId="OrtaListe2-Vurgu4">
     <w:name w:val="Medium List 2 Accent 4"/>
-    <w:basedOn w:val="TableNormal"/>
+    <w:basedOn w:val="NormalTablo"/>
     <w:uiPriority w:val="66"/>
     <w:rsid w:val="00CB0664"/>
     <w:pPr>
@@ -11515,9 +11528,9 @@
       </w:tcPr>
     </w:tblStylePr>
   </w:style>
-  <w:style w:type="table" w:styleId="MediumList2-Accent5">
+  <w:style w:type="table" w:styleId="OrtaListe2-Vurgu5">
     <w:name w:val="Medium List 2 Accent 5"/>
-    <w:basedOn w:val="TableNormal"/>
+    <w:basedOn w:val="NormalTablo"/>
     <w:uiPriority w:val="66"/>
     <w:rsid w:val="00CB0664"/>
     <w:pPr>
@@ -11636,9 +11649,9 @@
       </w:tcPr>
     </w:tblStylePr>
   </w:style>
-  <w:style w:type="table" w:styleId="MediumList2-Accent6">
+  <w:style w:type="table" w:styleId="OrtaListe2-Vurgu6">
     <w:name w:val="Medium List 2 Accent 6"/>
-    <w:basedOn w:val="TableNormal"/>
+    <w:basedOn w:val="NormalTablo"/>
     <w:uiPriority w:val="66"/>
     <w:rsid w:val="00CB0664"/>
     <w:pPr>
@@ -11757,9 +11770,9 @@
       </w:tcPr>
     </w:tblStylePr>
   </w:style>
-  <w:style w:type="table" w:styleId="MediumGrid1">
+  <w:style w:type="table" w:styleId="OrtaKlavuz1">
     <w:name w:val="Medium Grid 1"/>
-    <w:basedOn w:val="TableNormal"/>
+    <w:basedOn w:val="NormalTablo"/>
     <w:uiPriority w:val="67"/>
     <w:rsid w:val="00CB0664"/>
     <w:pPr>
@@ -11823,9 +11836,9 @@
       </w:tcPr>
     </w:tblStylePr>
   </w:style>
-  <w:style w:type="table" w:styleId="MediumGrid1-Accent1">
+  <w:style w:type="table" w:styleId="OrtaKlavuz1-Vurgu1">
     <w:name w:val="Medium Grid 1 Accent 1"/>
-    <w:basedOn w:val="TableNormal"/>
+    <w:basedOn w:val="NormalTablo"/>
     <w:uiPriority w:val="67"/>
     <w:rsid w:val="00CB0664"/>
     <w:pPr>
@@ -11889,9 +11902,9 @@
       </w:tcPr>
     </w:tblStylePr>
   </w:style>
-  <w:style w:type="table" w:styleId="MediumGrid1-Accent2">
+  <w:style w:type="table" w:styleId="OrtaKlavuz1-Vurgu2">
     <w:name w:val="Medium Grid 1 Accent 2"/>
-    <w:basedOn w:val="TableNormal"/>
+    <w:basedOn w:val="NormalTablo"/>
     <w:uiPriority w:val="67"/>
     <w:rsid w:val="00CB0664"/>
     <w:pPr>
@@ -11955,9 +11968,9 @@
       </w:tcPr>
     </w:tblStylePr>
   </w:style>
-  <w:style w:type="table" w:styleId="MediumGrid1-Accent3">
+  <w:style w:type="table" w:styleId="OrtaKlavuz1-Vurgu3">
     <w:name w:val="Medium Grid 1 Accent 3"/>
-    <w:basedOn w:val="TableNormal"/>
+    <w:basedOn w:val="NormalTablo"/>
     <w:uiPriority w:val="67"/>
     <w:rsid w:val="00CB0664"/>
     <w:pPr>
@@ -12021,9 +12034,9 @@
       </w:tcPr>
     </w:tblStylePr>
   </w:style>
-  <w:style w:type="table" w:styleId="MediumGrid1-Accent4">
+  <w:style w:type="table" w:styleId="OrtaKlavuz1-Vurgu4">
     <w:name w:val="Medium Grid 1 Accent 4"/>
-    <w:basedOn w:val="TableNormal"/>
+    <w:basedOn w:val="NormalTablo"/>
     <w:uiPriority w:val="67"/>
     <w:rsid w:val="00CB0664"/>
     <w:pPr>
@@ -12087,9 +12100,9 @@
       </w:tcPr>
     </w:tblStylePr>
   </w:style>
-  <w:style w:type="table" w:styleId="MediumGrid1-Accent5">
+  <w:style w:type="table" w:styleId="OrtaKlavuz1-Vurgu5">
     <w:name w:val="Medium Grid 1 Accent 5"/>
-    <w:basedOn w:val="TableNormal"/>
+    <w:basedOn w:val="NormalTablo"/>
     <w:uiPriority w:val="67"/>
     <w:rsid w:val="00CB0664"/>
     <w:pPr>
@@ -12153,9 +12166,9 @@
       </w:tcPr>
     </w:tblStylePr>
   </w:style>
-  <w:style w:type="table" w:styleId="MediumGrid1-Accent6">
+  <w:style w:type="table" w:styleId="OrtaKlavuz1-Vurgu6">
     <w:name w:val="Medium Grid 1 Accent 6"/>
-    <w:basedOn w:val="TableNormal"/>
+    <w:basedOn w:val="NormalTablo"/>
     <w:uiPriority w:val="67"/>
     <w:rsid w:val="00CB0664"/>
     <w:pPr>
@@ -12219,9 +12232,9 @@
       </w:tcPr>
     </w:tblStylePr>
   </w:style>
-  <w:style w:type="table" w:styleId="MediumGrid2">
+  <w:style w:type="table" w:styleId="OrtaKlavuz2">
     <w:name w:val="Medium Grid 2"/>
-    <w:basedOn w:val="TableNormal"/>
+    <w:basedOn w:val="NormalTablo"/>
     <w:uiPriority w:val="68"/>
     <w:rsid w:val="00CB0664"/>
     <w:pPr>
@@ -12337,9 +12350,9 @@
       </w:tcPr>
     </w:tblStylePr>
   </w:style>
-  <w:style w:type="table" w:styleId="MediumGrid2-Accent1">
+  <w:style w:type="table" w:styleId="OrtaKlavuz2-Vurgu1">
     <w:name w:val="Medium Grid 2 Accent 1"/>
-    <w:basedOn w:val="TableNormal"/>
+    <w:basedOn w:val="NormalTablo"/>
     <w:uiPriority w:val="68"/>
     <w:rsid w:val="00CB0664"/>
     <w:pPr>
@@ -12455,9 +12468,9 @@
       </w:tcPr>
     </w:tblStylePr>
   </w:style>
-  <w:style w:type="table" w:styleId="MediumGrid2-Accent2">
+  <w:style w:type="table" w:styleId="OrtaKlavuz2-Vurgu2">
     <w:name w:val="Medium Grid 2 Accent 2"/>
-    <w:basedOn w:val="TableNormal"/>
+    <w:basedOn w:val="NormalTablo"/>
     <w:uiPriority w:val="68"/>
     <w:rsid w:val="00CB0664"/>
     <w:pPr>
@@ -12573,9 +12586,9 @@
       </w:tcPr>
     </w:tblStylePr>
   </w:style>
-  <w:style w:type="table" w:styleId="MediumGrid2-Accent3">
+  <w:style w:type="table" w:styleId="OrtaKlavuz2-Vurgu3">
     <w:name w:val="Medium Grid 2 Accent 3"/>
-    <w:basedOn w:val="TableNormal"/>
+    <w:basedOn w:val="NormalTablo"/>
     <w:uiPriority w:val="68"/>
     <w:rsid w:val="00CB0664"/>
     <w:pPr>
@@ -12691,9 +12704,9 @@
       </w:tcPr>
     </w:tblStylePr>
   </w:style>
-  <w:style w:type="table" w:styleId="MediumGrid2-Accent4">
+  <w:style w:type="table" w:styleId="OrtaKlavuz2-Vurgu4">
     <w:name w:val="Medium Grid 2 Accent 4"/>
-    <w:basedOn w:val="TableNormal"/>
+    <w:basedOn w:val="NormalTablo"/>
     <w:uiPriority w:val="68"/>
     <w:rsid w:val="00CB0664"/>
     <w:pPr>
@@ -12809,9 +12822,9 @@
       </w:tcPr>
     </w:tblStylePr>
   </w:style>
-  <w:style w:type="table" w:styleId="MediumGrid2-Accent5">
+  <w:style w:type="table" w:styleId="OrtaKlavuz2-Vurgu5">
     <w:name w:val="Medium Grid 2 Accent 5"/>
-    <w:basedOn w:val="TableNormal"/>
+    <w:basedOn w:val="NormalTablo"/>
     <w:uiPriority w:val="68"/>
     <w:rsid w:val="00CB0664"/>
     <w:pPr>
@@ -12927,9 +12940,9 @@
       </w:tcPr>
     </w:tblStylePr>
   </w:style>
-  <w:style w:type="table" w:styleId="MediumGrid2-Accent6">
+  <w:style w:type="table" w:styleId="OrtaKlavuz2-Vurgu6">
     <w:name w:val="Medium Grid 2 Accent 6"/>
-    <w:basedOn w:val="TableNormal"/>
+    <w:basedOn w:val="NormalTablo"/>
     <w:uiPriority w:val="68"/>
     <w:rsid w:val="00CB0664"/>
     <w:pPr>
@@ -13045,9 +13058,9 @@
       </w:tcPr>
     </w:tblStylePr>
   </w:style>
-  <w:style w:type="table" w:styleId="MediumGrid3">
+  <w:style w:type="table" w:styleId="OrtaKlavuz3">
     <w:name w:val="Medium Grid 3"/>
-    <w:basedOn w:val="TableNormal"/>
+    <w:basedOn w:val="NormalTablo"/>
     <w:uiPriority w:val="69"/>
     <w:rsid w:val="00CB0664"/>
     <w:pPr>
@@ -13179,9 +13192,9 @@
       </w:tcPr>
     </w:tblStylePr>
   </w:style>
-  <w:style w:type="table" w:styleId="MediumGrid3-Accent1">
+  <w:style w:type="table" w:styleId="OrtaKlavuz3-Vurgu1">
     <w:name w:val="Medium Grid 3 Accent 1"/>
-    <w:basedOn w:val="TableNormal"/>
+    <w:basedOn w:val="NormalTablo"/>
     <w:uiPriority w:val="69"/>
     <w:rsid w:val="00CB0664"/>
     <w:pPr>
@@ -13313,9 +13326,9 @@
       </w:tcPr>
     </w:tblStylePr>
   </w:style>
-  <w:style w:type="table" w:styleId="MediumGrid3-Accent2">
+  <w:style w:type="table" w:styleId="OrtaKlavuz3-Vurgu2">
     <w:name w:val="Medium Grid 3 Accent 2"/>
-    <w:basedOn w:val="TableNormal"/>
+    <w:basedOn w:val="NormalTablo"/>
     <w:uiPriority w:val="69"/>
     <w:rsid w:val="00CB0664"/>
     <w:pPr>
@@ -13447,9 +13460,9 @@
       </w:tcPr>
     </w:tblStylePr>
   </w:style>
-  <w:style w:type="table" w:styleId="MediumGrid3-Accent3">
+  <w:style w:type="table" w:styleId="OrtaKlavuz3-Vurgu3">
     <w:name w:val="Medium Grid 3 Accent 3"/>
-    <w:basedOn w:val="TableNormal"/>
+    <w:basedOn w:val="NormalTablo"/>
     <w:uiPriority w:val="69"/>
     <w:rsid w:val="00CB0664"/>
     <w:pPr>
@@ -13581,9 +13594,9 @@
       </w:tcPr>
     </w:tblStylePr>
   </w:style>
-  <w:style w:type="table" w:styleId="MediumGrid3-Accent4">
+  <w:style w:type="table" w:styleId="OrtaKlavuz3-Vurgu4">
     <w:name w:val="Medium Grid 3 Accent 4"/>
-    <w:basedOn w:val="TableNormal"/>
+    <w:basedOn w:val="NormalTablo"/>
     <w:uiPriority w:val="69"/>
     <w:rsid w:val="00CB0664"/>
     <w:pPr>
@@ -13715,9 +13728,9 @@
       </w:tcPr>
     </w:tblStylePr>
   </w:style>
-  <w:style w:type="table" w:styleId="MediumGrid3-Accent5">
+  <w:style w:type="table" w:styleId="OrtaKlavuz3-Vurgu5">
     <w:name w:val="Medium Grid 3 Accent 5"/>
-    <w:basedOn w:val="TableNormal"/>
+    <w:basedOn w:val="NormalTablo"/>
     <w:uiPriority w:val="69"/>
     <w:rsid w:val="00CB0664"/>
     <w:pPr>
@@ -13849,9 +13862,9 @@
       </w:tcPr>
     </w:tblStylePr>
   </w:style>
-  <w:style w:type="table" w:styleId="MediumGrid3-Accent6">
+  <w:style w:type="table" w:styleId="OrtaKlavuz3-Vurgu6">
     <w:name w:val="Medium Grid 3 Accent 6"/>
-    <w:basedOn w:val="TableNormal"/>
+    <w:basedOn w:val="NormalTablo"/>
     <w:uiPriority w:val="69"/>
     <w:rsid w:val="00CB0664"/>
     <w:pPr>
@@ -13983,9 +13996,9 @@
       </w:tcPr>
     </w:tblStylePr>
   </w:style>
-  <w:style w:type="table" w:styleId="DarkList">
+  <w:style w:type="table" w:styleId="KoyuListe">
     <w:name w:val="Dark List"/>
-    <w:basedOn w:val="TableNormal"/>
+    <w:basedOn w:val="NormalTablo"/>
     <w:uiPriority w:val="70"/>
     <w:rsid w:val="00CB0664"/>
     <w:pPr>
@@ -14090,9 +14103,9 @@
       </w:tcPr>
     </w:tblStylePr>
   </w:style>
-  <w:style w:type="table" w:styleId="DarkList-Accent1">
+  <w:style w:type="table" w:styleId="KoyuListe-Vurgu1">
     <w:name w:val="Dark List Accent 1"/>
-    <w:basedOn w:val="TableNormal"/>
+    <w:basedOn w:val="NormalTablo"/>
     <w:uiPriority w:val="70"/>
     <w:rsid w:val="00CB0664"/>
     <w:pPr>
@@ -14197,9 +14210,9 @@
       </w:tcPr>
     </w:tblStylePr>
   </w:style>
-  <w:style w:type="table" w:styleId="DarkList-Accent2">
+  <w:style w:type="table" w:styleId="KoyuListe-Vurgu2">
     <w:name w:val="Dark List Accent 2"/>
-    <w:basedOn w:val="TableNormal"/>
+    <w:basedOn w:val="NormalTablo"/>
     <w:uiPriority w:val="70"/>
     <w:rsid w:val="00CB0664"/>
     <w:pPr>
@@ -14304,9 +14317,9 @@
       </w:tcPr>
     </w:tblStylePr>
   </w:style>
-  <w:style w:type="table" w:styleId="DarkList-Accent3">
+  <w:style w:type="table" w:styleId="KoyuListe-Vurgu3">
     <w:name w:val="Dark List Accent 3"/>
-    <w:basedOn w:val="TableNormal"/>
+    <w:basedOn w:val="NormalTablo"/>
     <w:uiPriority w:val="70"/>
     <w:rsid w:val="00CB0664"/>
     <w:pPr>
@@ -14411,9 +14424,9 @@
       </w:tcPr>
     </w:tblStylePr>
   </w:style>
-  <w:style w:type="table" w:styleId="DarkList-Accent4">
+  <w:style w:type="table" w:styleId="KoyuListe-Vurgu4">
     <w:name w:val="Dark List Accent 4"/>
-    <w:basedOn w:val="TableNormal"/>
+    <w:basedOn w:val="NormalTablo"/>
     <w:uiPriority w:val="70"/>
     <w:rsid w:val="00CB0664"/>
     <w:pPr>
@@ -14518,9 +14531,9 @@
       </w:tcPr>
     </w:tblStylePr>
   </w:style>
-  <w:style w:type="table" w:styleId="DarkList-Accent5">
+  <w:style w:type="table" w:styleId="KoyuListe-Vurgu5">
     <w:name w:val="Dark List Accent 5"/>
-    <w:basedOn w:val="TableNormal"/>
+    <w:basedOn w:val="NormalTablo"/>
     <w:uiPriority w:val="70"/>
     <w:rsid w:val="00CB0664"/>
     <w:pPr>
@@ -14625,9 +14638,9 @@
       </w:tcPr>
     </w:tblStylePr>
   </w:style>
-  <w:style w:type="table" w:styleId="DarkList-Accent6">
+  <w:style w:type="table" w:styleId="KoyuListe-Vurgu6">
     <w:name w:val="Dark List Accent 6"/>
-    <w:basedOn w:val="TableNormal"/>
+    <w:basedOn w:val="NormalTablo"/>
     <w:uiPriority w:val="70"/>
     <w:rsid w:val="00CB0664"/>
     <w:pPr>
@@ -14732,9 +14745,9 @@
       </w:tcPr>
     </w:tblStylePr>
   </w:style>
-  <w:style w:type="table" w:styleId="ColorfulShading">
+  <w:style w:type="table" w:styleId="RenkliGlgeleme">
     <w:name w:val="Colorful Shading"/>
-    <w:basedOn w:val="TableNormal"/>
+    <w:basedOn w:val="NormalTablo"/>
     <w:uiPriority w:val="71"/>
     <w:rsid w:val="00CB0664"/>
     <w:pPr>
@@ -14847,9 +14860,9 @@
       </w:rPr>
     </w:tblStylePr>
   </w:style>
-  <w:style w:type="table" w:styleId="ColorfulShading-Accent1">
+  <w:style w:type="table" w:styleId="RenkliGlgeleme-Vurgu1">
     <w:name w:val="Colorful Shading Accent 1"/>
-    <w:basedOn w:val="TableNormal"/>
+    <w:basedOn w:val="NormalTablo"/>
     <w:uiPriority w:val="71"/>
     <w:rsid w:val="00CB0664"/>
     <w:pPr>
@@ -14962,9 +14975,9 @@
       </w:rPr>
     </w:tblStylePr>
   </w:style>
-  <w:style w:type="table" w:styleId="ColorfulShading-Accent2">
+  <w:style w:type="table" w:styleId="RenkliGlgeleme-Vurgu2">
     <w:name w:val="Colorful Shading Accent 2"/>
-    <w:basedOn w:val="TableNormal"/>
+    <w:basedOn w:val="NormalTablo"/>
     <w:uiPriority w:val="71"/>
     <w:rsid w:val="00CB0664"/>
     <w:pPr>
@@ -15077,9 +15090,9 @@
       </w:rPr>
     </w:tblStylePr>
   </w:style>
-  <w:style w:type="table" w:styleId="ColorfulShading-Accent3">
+  <w:style w:type="table" w:styleId="RenkliGlgeleme-Vurgu3">
     <w:name w:val="Colorful Shading Accent 3"/>
-    <w:basedOn w:val="TableNormal"/>
+    <w:basedOn w:val="NormalTablo"/>
     <w:uiPriority w:val="71"/>
     <w:rsid w:val="00CB0664"/>
     <w:pPr>
@@ -15182,9 +15195,9 @@
       </w:tcPr>
     </w:tblStylePr>
   </w:style>
-  <w:style w:type="table" w:styleId="ColorfulShading-Accent4">
+  <w:style w:type="table" w:styleId="RenkliGlgeleme-Vurgu4">
     <w:name w:val="Colorful Shading Accent 4"/>
-    <w:basedOn w:val="TableNormal"/>
+    <w:basedOn w:val="NormalTablo"/>
     <w:uiPriority w:val="71"/>
     <w:rsid w:val="00CB0664"/>
     <w:pPr>
@@ -15297,9 +15310,9 @@
       </w:rPr>
     </w:tblStylePr>
   </w:style>
-  <w:style w:type="table" w:styleId="ColorfulShading-Accent5">
+  <w:style w:type="table" w:styleId="RenkliGlgeleme-Vurgu5">
     <w:name w:val="Colorful Shading Accent 5"/>
-    <w:basedOn w:val="TableNormal"/>
+    <w:basedOn w:val="NormalTablo"/>
     <w:uiPriority w:val="71"/>
     <w:rsid w:val="00CB0664"/>
     <w:pPr>
@@ -15412,9 +15425,9 @@
       </w:rPr>
     </w:tblStylePr>
   </w:style>
-  <w:style w:type="table" w:styleId="ColorfulShading-Accent6">
+  <w:style w:type="table" w:styleId="RenkliGlgeleme-Vurgu6">
     <w:name w:val="Colorful Shading Accent 6"/>
-    <w:basedOn w:val="TableNormal"/>
+    <w:basedOn w:val="NormalTablo"/>
     <w:uiPriority w:val="71"/>
     <w:rsid w:val="00CB0664"/>
     <w:pPr>
@@ -15527,9 +15540,9 @@
       </w:rPr>
     </w:tblStylePr>
   </w:style>
-  <w:style w:type="table" w:styleId="ColorfulList">
+  <w:style w:type="table" w:styleId="RenkliListe">
     <w:name w:val="Colorful List"/>
-    <w:basedOn w:val="TableNormal"/>
+    <w:basedOn w:val="NormalTablo"/>
     <w:uiPriority w:val="72"/>
     <w:rsid w:val="00CB0664"/>
     <w:pPr>
@@ -15606,9 +15619,9 @@
       </w:tcPr>
     </w:tblStylePr>
   </w:style>
-  <w:style w:type="table" w:styleId="ColorfulList-Accent1">
+  <w:style w:type="table" w:styleId="RenkliListe-Vurgu1">
     <w:name w:val="Colorful List Accent 1"/>
-    <w:basedOn w:val="TableNormal"/>
+    <w:basedOn w:val="NormalTablo"/>
     <w:uiPriority w:val="72"/>
     <w:rsid w:val="00CB0664"/>
     <w:pPr>
@@ -15685,9 +15698,9 @@
       </w:tcPr>
     </w:tblStylePr>
   </w:style>
-  <w:style w:type="table" w:styleId="ColorfulList-Accent2">
+  <w:style w:type="table" w:styleId="RenkliListe-Vurgu2">
     <w:name w:val="Colorful List Accent 2"/>
-    <w:basedOn w:val="TableNormal"/>
+    <w:basedOn w:val="NormalTablo"/>
     <w:uiPriority w:val="72"/>
     <w:rsid w:val="00CB0664"/>
     <w:pPr>
@@ -15764,9 +15777,9 @@
       </w:tcPr>
     </w:tblStylePr>
   </w:style>
-  <w:style w:type="table" w:styleId="ColorfulList-Accent3">
+  <w:style w:type="table" w:styleId="RenkliListe-Vurgu3">
     <w:name w:val="Colorful List Accent 3"/>
-    <w:basedOn w:val="TableNormal"/>
+    <w:basedOn w:val="NormalTablo"/>
     <w:uiPriority w:val="72"/>
     <w:rsid w:val="00CB0664"/>
     <w:pPr>
@@ -15843,9 +15856,9 @@
       </w:tcPr>
     </w:tblStylePr>
   </w:style>
-  <w:style w:type="table" w:styleId="ColorfulList-Accent4">
+  <w:style w:type="table" w:styleId="RenkliListe-Vurgu4">
     <w:name w:val="Colorful List Accent 4"/>
-    <w:basedOn w:val="TableNormal"/>
+    <w:basedOn w:val="NormalTablo"/>
     <w:uiPriority w:val="72"/>
     <w:rsid w:val="00CB0664"/>
     <w:pPr>
@@ -15922,9 +15935,9 @@
       </w:tcPr>
     </w:tblStylePr>
   </w:style>
-  <w:style w:type="table" w:styleId="ColorfulList-Accent5">
+  <w:style w:type="table" w:styleId="RenkliListe-Vurgu5">
     <w:name w:val="Colorful List Accent 5"/>
-    <w:basedOn w:val="TableNormal"/>
+    <w:basedOn w:val="NormalTablo"/>
     <w:uiPriority w:val="72"/>
     <w:rsid w:val="00CB0664"/>
     <w:pPr>
@@ -16001,9 +16014,9 @@
       </w:tcPr>
     </w:tblStylePr>
   </w:style>
-  <w:style w:type="table" w:styleId="ColorfulList-Accent6">
+  <w:style w:type="table" w:styleId="RenkliListe-Vurgu6">
     <w:name w:val="Colorful List Accent 6"/>
-    <w:basedOn w:val="TableNormal"/>
+    <w:basedOn w:val="NormalTablo"/>
     <w:uiPriority w:val="72"/>
     <w:rsid w:val="00CB0664"/>
     <w:pPr>
@@ -16080,9 +16093,9 @@
       </w:tcPr>
     </w:tblStylePr>
   </w:style>
-  <w:style w:type="table" w:styleId="ColorfulGrid">
+  <w:style w:type="table" w:styleId="RenkliKlavuz">
     <w:name w:val="Colorful Grid"/>
-    <w:basedOn w:val="TableNormal"/>
+    <w:basedOn w:val="NormalTablo"/>
     <w:uiPriority w:val="73"/>
     <w:rsid w:val="00CB0664"/>
     <w:pPr>
@@ -16153,9 +16166,9 @@
       </w:tcPr>
     </w:tblStylePr>
   </w:style>
-  <w:style w:type="table" w:styleId="ColorfulGrid-Accent1">
+  <w:style w:type="table" w:styleId="RenkliKlavuz-Vurgu1">
     <w:name w:val="Colorful Grid Accent 1"/>
-    <w:basedOn w:val="TableNormal"/>
+    <w:basedOn w:val="NormalTablo"/>
     <w:uiPriority w:val="73"/>
     <w:rsid w:val="00CB0664"/>
     <w:pPr>
@@ -16226,9 +16239,9 @@
       </w:tcPr>
     </w:tblStylePr>
   </w:style>
-  <w:style w:type="table" w:styleId="ColorfulGrid-Accent2">
+  <w:style w:type="table" w:styleId="RenkliKlavuz-Vurgu2">
     <w:name w:val="Colorful Grid Accent 2"/>
-    <w:basedOn w:val="TableNormal"/>
+    <w:basedOn w:val="NormalTablo"/>
     <w:uiPriority w:val="73"/>
     <w:rsid w:val="00CB0664"/>
     <w:pPr>
@@ -16299,9 +16312,9 @@
       </w:tcPr>
     </w:tblStylePr>
   </w:style>
-  <w:style w:type="table" w:styleId="ColorfulGrid-Accent3">
+  <w:style w:type="table" w:styleId="RenkliKlavuz-Vurgu3">
     <w:name w:val="Colorful Grid Accent 3"/>
-    <w:basedOn w:val="TableNormal"/>
+    <w:basedOn w:val="NormalTablo"/>
     <w:uiPriority w:val="73"/>
     <w:rsid w:val="00CB0664"/>
     <w:pPr>
@@ -16372,9 +16385,9 @@
       </w:tcPr>
     </w:tblStylePr>
   </w:style>
-  <w:style w:type="table" w:styleId="ColorfulGrid-Accent4">
+  <w:style w:type="table" w:styleId="RenkliKlavuz-Vurgu4">
     <w:name w:val="Colorful Grid Accent 4"/>
-    <w:basedOn w:val="TableNormal"/>
+    <w:basedOn w:val="NormalTablo"/>
     <w:uiPriority w:val="73"/>
     <w:rsid w:val="00CB0664"/>
     <w:pPr>
@@ -16445,9 +16458,9 @@
       </w:tcPr>
     </w:tblStylePr>
   </w:style>
-  <w:style w:type="table" w:styleId="ColorfulGrid-Accent5">
+  <w:style w:type="table" w:styleId="RenkliKlavuz-Vurgu5">
     <w:name w:val="Colorful Grid Accent 5"/>
-    <w:basedOn w:val="TableNormal"/>
+    <w:basedOn w:val="NormalTablo"/>
     <w:uiPriority w:val="73"/>
     <w:rsid w:val="00CB0664"/>
     <w:pPr>
@@ -16518,9 +16531,9 @@
       </w:tcPr>
     </w:tblStylePr>
   </w:style>
-  <w:style w:type="table" w:styleId="ColorfulGrid-Accent6">
+  <w:style w:type="table" w:styleId="RenkliKlavuz-Vurgu6">
     <w:name w:val="Colorful Grid Accent 6"/>
-    <w:basedOn w:val="TableNormal"/>
+    <w:basedOn w:val="NormalTablo"/>
     <w:uiPriority w:val="73"/>
     <w:rsid w:val="00CB0664"/>
     <w:pPr>

</xml_diff>